<commit_message>
Match RP7.4 docx to RP7.3 house style (banner, fonts, teal headings, green tables)
- Reference-doc RP7.4_reference.docx derivato dalla RP7.3 fornita: banner di
  intestazione con logo, piè di pagina, Times New Roman 11pt, stili titolo teal
  (024C41) e stile tabella; usato come pandoc reference-doc.
- Post-processing (python-docx, preserva le equazioni OMML): prima riga di ogni
  tabella con sfondo verde 0B5A3C e testo bianco grassetto, come in RP7.3.
- Rimosso dal corpo il banner (ora nell'header di pagina); titolo centrato.
- Verificato: 115 equazioni native, 9 tabelle, 2 figure, header/footer RP7.3.

Co-Authored-By: Claude Opus 4.8 <noreply@anthropic.com>
Claude-Session: https://claude.ai/code/session_01TDWdb7nMyYxCAQNw9GyeGc
</commit_message>
<xml_diff>
--- a/RP7.4 Report di Product Technological Sustainability Assessment.docx
+++ b/RP7.4 Report di Product Technological Sustainability Assessment.docx
@@ -2,6 +2,15 @@
 <file path=word/document.xml><?xml version="1.0" encoding="utf-8"?>
 <w:document xmlns:w="http://schemas.openxmlformats.org/wordprocessingml/2006/main" xmlns:m="http://schemas.openxmlformats.org/officeDocument/2006/math" xmlns:r="http://schemas.openxmlformats.org/officeDocument/2006/relationships" xmlns:o="urn:schemas-microsoft-com:office:office" xmlns:v="urn:schemas-microsoft-com:vml" xmlns:w10="urn:schemas-microsoft-com:office:word" xmlns:a="http://schemas.openxmlformats.org/drawingml/2006/main" xmlns:pic="http://schemas.openxmlformats.org/drawingml/2006/picture" xmlns:wp="http://schemas.openxmlformats.org/drawingml/2006/wordprocessingDrawing">
   <w:body>
+    <w:bookmarkStart w:id="123" w:name="X3d3aa2ba8654d3710fa6e88f18d7705f2c93969"/>
+    <w:p>
+      <w:pPr>
+        <w:pStyle w:val="Heading1"/>
+      </w:pPr>
+      <w:r>
+        <w:t xml:space="preserve">Product Technological Sustainability Assessment (P-TSA)</w:t>
+      </w:r>
+    </w:p>
     <w:p>
       <w:pPr>
         <w:pStyle w:val="FirstParagraph"/>
@@ -11,7 +20,13 @@
           <w:b/>
           <w:bCs/>
         </w:rPr>
-        <w:t xml:space="preserve">SusTainable dAta-dRiven manufacTuring</w:t>
+        <w:t xml:space="preserve">Relazione Parziale N°:</w:t>
+      </w:r>
+      <w:r>
+        <w:t xml:space="preserve"> </w:t>
+      </w:r>
+      <w:r>
+        <w:t xml:space="preserve">RP7.4</w:t>
       </w:r>
     </w:p>
     <w:p>
@@ -19,50 +34,79 @@
         <w:pStyle w:val="BodyText"/>
       </w:pPr>
       <w:r>
-        <w:t xml:space="preserve">Accordo Innovazione DM 31/12/2021 — Prog. n. F/310087/01-05/X56 — www.start-innovability.it</w:t>
-      </w:r>
-    </w:p>
-    <w:bookmarkStart w:id="63" w:name="X3d3aa2ba8654d3710fa6e88f18d7705f2c93969"/>
-    <w:p>
-      <w:pPr>
-        <w:pStyle w:val="Heading1"/>
-      </w:pPr>
-      <w:r>
-        <w:t xml:space="preserve">Product Technological Sustainability Assessment (P-TSA)</w:t>
+        <w:rPr>
+          <w:b/>
+          <w:bCs/>
+        </w:rPr>
+        <w:t xml:space="preserve">Versione del Documento:</w:t>
+      </w:r>
+      <w:r>
+        <w:t xml:space="preserve"> </w:t>
+      </w:r>
+      <w:r>
+        <w:t xml:space="preserve">RV.1</w:t>
       </w:r>
     </w:p>
     <w:p>
       <w:pPr>
-        <w:pStyle w:val="FirstParagraph"/>
+        <w:pStyle w:val="BodyText"/>
       </w:pPr>
       <w:r>
         <w:rPr>
           <w:b/>
           <w:bCs/>
         </w:rPr>
-        <w:t xml:space="preserve">Relazione Parziale N°:</w:t>
-      </w:r>
-      <w:r>
-        <w:t xml:space="preserve"> </w:t>
-      </w:r>
-      <w:r>
-        <w:t xml:space="preserve">RP7.4  • </w:t>
-      </w:r>
-      <w:r>
-        <w:t xml:space="preserve"> </w:t>
-      </w:r>
+        <w:t xml:space="preserve">Data di Revisione del Documento:</w:t>
+      </w:r>
+      <w:r>
+        <w:t xml:space="preserve"> </w:t>
+      </w:r>
+      <w:r>
+        <w:t xml:space="preserve">07.08.2026</w:t>
+      </w:r>
+    </w:p>
+    <w:p>
+      <w:pPr>
+        <w:pStyle w:val="BodyText"/>
+      </w:pPr>
       <w:r>
         <w:rPr>
           <w:b/>
           <w:bCs/>
         </w:rPr>
-        <w:t xml:space="preserve">Versione del Documento:</w:t>
-      </w:r>
-      <w:r>
-        <w:t xml:space="preserve"> </w:t>
-      </w:r>
-      <w:r>
-        <w:t xml:space="preserve">RV.1  • </w:t>
+        <w:t xml:space="preserve">Responsabilità:</w:t>
+      </w:r>
+      <w:r>
+        <w:t xml:space="preserve"> </w:t>
+      </w:r>
+      <w:r>
+        <w:t xml:space="preserve">Gresmalt — Capofila</w:t>
+      </w:r>
+    </w:p>
+    <w:bookmarkStart w:id="89" w:name="introduzione"/>
+    <w:p>
+      <w:pPr>
+        <w:pStyle w:val="Heading2"/>
+      </w:pPr>
+      <w:r>
+        <w:t xml:space="preserve">1. INTRODUZIONE</w:t>
+      </w:r>
+    </w:p>
+    <w:bookmarkStart w:id="86" w:name="inquadramento-dellattività"/>
+    <w:p>
+      <w:pPr>
+        <w:pStyle w:val="Heading3"/>
+      </w:pPr>
+      <w:r>
+        <w:t xml:space="preserve">1.1 Inquadramento dell’attività</w:t>
+      </w:r>
+    </w:p>
+    <w:p>
+      <w:pPr>
+        <w:pStyle w:val="FirstParagraph"/>
+      </w:pPr>
+      <w:r>
+        <w:t xml:space="preserve">L’attività 7.4 costituisce la naturale estensione, sul piano del</w:t>
       </w:r>
       <w:r>
         <w:t xml:space="preserve"> </w:t>
@@ -72,13 +116,22 @@
           <w:b/>
           <w:bCs/>
         </w:rPr>
-        <w:t xml:space="preserve">Data di Revisione del Documento:</w:t>
-      </w:r>
-      <w:r>
-        <w:t xml:space="preserve"> </w:t>
-      </w:r>
-      <w:r>
-        <w:t xml:space="preserve">07.08.2026  • </w:t>
+        <w:t xml:space="preserve">prodotto</w:t>
+      </w:r>
+      <w:r>
+        <w:t xml:space="preserve">, del</w:t>
+      </w:r>
+      <w:r>
+        <w:t xml:space="preserve"> </w:t>
+      </w:r>
+      <w:r>
+        <w:t xml:space="preserve">percorso di misurazione della sostenibilità tecnologica che il progetto START ha</w:t>
+      </w:r>
+      <w:r>
+        <w:t xml:space="preserve"> </w:t>
+      </w:r>
+      <w:r>
+        <w:t xml:space="preserve">sviluppato a livello di</w:t>
       </w:r>
       <w:r>
         <w:t xml:space="preserve"> </w:t>
@@ -88,46 +141,274 @@
           <w:b/>
           <w:bCs/>
         </w:rPr>
-        <w:t xml:space="preserve">Responsabilità:</w:t>
-      </w:r>
-      <w:r>
-        <w:t xml:space="preserve"> </w:t>
-      </w:r>
-      <w:r>
-        <w:t xml:space="preserve">Gresmalt — Capofila</w:t>
+        <w:t xml:space="preserve">processo/fabbrica</w:t>
+      </w:r>
+      <w:r>
+        <w:t xml:space="preserve"> </w:t>
+      </w:r>
+      <w:r>
+        <w:t xml:space="preserve">con l’attività 7.3. Mentre l’OR7.3</w:t>
+      </w:r>
+      <w:r>
+        <w:t xml:space="preserve"> </w:t>
+      </w:r>
+      <w:r>
+        <w:t xml:space="preserve">determina, attraverso l’</w:t>
+      </w:r>
+      <w:r>
+        <w:rPr>
+          <w:i/>
+          <w:iCs/>
+        </w:rPr>
+        <w:t xml:space="preserve">Extended Exergy Accounting Plus</w:t>
+      </w:r>
+      <w:r>
+        <w:t xml:space="preserve"> </w:t>
+      </w:r>
+      <w:r>
+        <w:t xml:space="preserve">(EEA+), un indice</w:t>
+      </w:r>
+      <w:r>
+        <w:t xml:space="preserve"> </w:t>
+      </w:r>
+      <w:r>
+        <w:t xml:space="preserve">termodinamico di sostenibilità (TSI) che sintetizza le prestazioni ambientali,</w:t>
+      </w:r>
+      <w:r>
+        <w:t xml:space="preserve"> </w:t>
+      </w:r>
+      <w:r>
+        <w:t xml:space="preserve">economiche, sociali e tecnologiche del sistema produttivo, l’OR7.4 sposta il</w:t>
+      </w:r>
+      <w:r>
+        <w:t xml:space="preserve"> </w:t>
+      </w:r>
+      <w:r>
+        <w:t xml:space="preserve">fuoco di analisi sul manufatto ceramico e ne quantifica la</w:t>
+      </w:r>
+      <w:r>
+        <w:t xml:space="preserve"> </w:t>
+      </w:r>
+      <w:r>
+        <w:rPr>
+          <w:b/>
+          <w:bCs/>
+        </w:rPr>
+        <w:t xml:space="preserve">sostenibilità</w:t>
+      </w:r>
+      <w:r>
+        <w:rPr>
+          <w:b/>
+          <w:bCs/>
+        </w:rPr>
+        <w:t xml:space="preserve"> </w:t>
+      </w:r>
+      <w:r>
+        <w:rPr>
+          <w:b/>
+          <w:bCs/>
+        </w:rPr>
+        <w:t xml:space="preserve">tecnologica</w:t>
+      </w:r>
+      <w:r>
+        <w:t xml:space="preserve">, ossia la capacità del sistema-prodotto di mantenere nel tempo</w:t>
+      </w:r>
+      <w:r>
+        <w:t xml:space="preserve"> </w:t>
+      </w:r>
+      <w:r>
+        <w:t xml:space="preserve">prestazioni operative e conformità normativa lungo l’intera catena del valore.</w:t>
       </w:r>
     </w:p>
     <w:p>
-      <w:r>
-        <w:pict>
-          <v:rect style="width:0;height:1.5pt" o:hralign="center" o:hrstd="t" o:hr="t"/>
-        </w:pict>
-      </w:r>
-    </w:p>
-    <w:bookmarkStart w:id="29" w:name="introduzione"/>
-    <w:p>
-      <w:pPr>
-        <w:pStyle w:val="Heading2"/>
-      </w:pPr>
-      <w:r>
-        <w:t xml:space="preserve">1. INTRODUZIONE</w:t>
-      </w:r>
-    </w:p>
-    <w:bookmarkStart w:id="26" w:name="inquadramento-dellattività"/>
-    <w:p>
-      <w:pPr>
-        <w:pStyle w:val="Heading3"/>
-      </w:pPr>
-      <w:r>
-        <w:t xml:space="preserve">1.1 Inquadramento dell’attività</w:t>
+      <w:pPr>
+        <w:pStyle w:val="BodyText"/>
+      </w:pPr>
+      <w:r>
+        <w:t xml:space="preserve">Il Piano di Sviluppo assegna all’attività l’applicazione della metodologia</w:t>
+      </w:r>
+      <w:r>
+        <w:t xml:space="preserve"> </w:t>
+      </w:r>
+      <w:r>
+        <w:rPr>
+          <w:b/>
+          <w:bCs/>
+        </w:rPr>
+        <w:t xml:space="preserve">P-TSA</w:t>
+      </w:r>
+      <w:r>
+        <w:t xml:space="preserve"> </w:t>
+      </w:r>
+      <w:r>
+        <w:t xml:space="preserve">secondo l’approccio del ciclo di vita (</w:t>
+      </w:r>
+      <w:r>
+        <w:rPr>
+          <w:i/>
+          <w:iCs/>
+        </w:rPr>
+        <w:t xml:space="preserve">Life Cycle Thinking</w:t>
+      </w:r>
+      <w:r>
+        <w:t xml:space="preserve">, LCT) e lo</w:t>
+      </w:r>
+      <w:r>
+        <w:t xml:space="preserve"> </w:t>
+      </w:r>
+      <w:r>
+        <w:t xml:space="preserve">schema operativo della norma</w:t>
+      </w:r>
+      <w:r>
+        <w:t xml:space="preserve"> </w:t>
+      </w:r>
+      <w:r>
+        <w:rPr>
+          <w:b/>
+          <w:bCs/>
+        </w:rPr>
+        <w:t xml:space="preserve">ISO 14040</w:t>
+      </w:r>
+      <w:r>
+        <w:t xml:space="preserve">, adottando una prospettiva di supply</w:t>
+      </w:r>
+      <w:r>
+        <w:t xml:space="preserve"> </w:t>
+      </w:r>
+      <w:r>
+        <w:t xml:space="preserve">chain</w:t>
+      </w:r>
+      <w:r>
+        <w:t xml:space="preserve"> </w:t>
+      </w:r>
+      <w:r>
+        <w:rPr>
+          <w:b/>
+          <w:bCs/>
+        </w:rPr>
+        <w:t xml:space="preserve">cradle-to-grave</w:t>
+      </w:r>
+      <w:r>
+        <w:t xml:space="preserve">. La sostenibilità tecnologica del prodotto è misurata</w:t>
+      </w:r>
+      <w:r>
+        <w:t xml:space="preserve"> </w:t>
+      </w:r>
+      <w:r>
+        <w:t xml:space="preserve">rispetto a tre categorie d’impatto tecnologico —</w:t>
+      </w:r>
+      <w:r>
+        <w:t xml:space="preserve"> </w:t>
+      </w:r>
+      <w:r>
+        <w:rPr>
+          <w:b/>
+          <w:bCs/>
+        </w:rPr>
+        <w:t xml:space="preserve">In-/Outputs Availability</w:t>
+      </w:r>
+      <w:r>
+        <w:rPr>
+          <w:b/>
+          <w:bCs/>
+        </w:rPr>
+        <w:t xml:space="preserve"> </w:t>
+      </w:r>
+      <w:r>
+        <w:rPr>
+          <w:b/>
+          <w:bCs/>
+        </w:rPr>
+        <w:t xml:space="preserve">(IOA)</w:t>
+      </w:r>
+      <w:r>
+        <w:t xml:space="preserve">,</w:t>
+      </w:r>
+      <w:r>
+        <w:t xml:space="preserve"> </w:t>
+      </w:r>
+      <w:r>
+        <w:rPr>
+          <w:b/>
+          <w:bCs/>
+        </w:rPr>
+        <w:t xml:space="preserve">Operational Performance (OP)</w:t>
+      </w:r>
+      <w:r>
+        <w:t xml:space="preserve"> </w:t>
+      </w:r>
+      <w:r>
+        <w:t xml:space="preserve">e</w:t>
+      </w:r>
+      <w:r>
+        <w:t xml:space="preserve"> </w:t>
+      </w:r>
+      <w:r>
+        <w:rPr>
+          <w:b/>
+          <w:bCs/>
+        </w:rPr>
+        <w:t xml:space="preserve">Technical Quality (TQ)</w:t>
+      </w:r>
+      <w:r>
+        <w:t xml:space="preserve"> </w:t>
+      </w:r>
+      <w:r>
+        <w:t xml:space="preserve">— combinando</w:t>
+      </w:r>
+      <w:r>
+        <w:t xml:space="preserve"> </w:t>
+      </w:r>
+      <w:r>
+        <w:t xml:space="preserve">metriche elementari in indicatori e, per aggregazione e normalizzazione, in un</w:t>
+      </w:r>
+      <w:r>
+        <w:t xml:space="preserve"> </w:t>
+      </w:r>
+      <w:r>
+        <w:t xml:space="preserve">indice sintetico, il</w:t>
+      </w:r>
+      <w:r>
+        <w:t xml:space="preserve"> </w:t>
+      </w:r>
+      <w:r>
+        <w:rPr>
+          <w:b/>
+          <w:bCs/>
+        </w:rPr>
+        <w:t xml:space="preserve">Product Technology Sustainability Index (P-TSI)</w:t>
+      </w:r>
+      <w:r>
+        <w:t xml:space="preserve">.</w:t>
       </w:r>
     </w:p>
     <w:p>
       <w:pPr>
-        <w:pStyle w:val="FirstParagraph"/>
-      </w:pPr>
-      <w:r>
-        <w:t xml:space="preserve">L’attività 7.4 costituisce la naturale estensione, sul piano del</w:t>
+        <w:pStyle w:val="BodyText"/>
+      </w:pPr>
+      <w:r>
+        <w:t xml:space="preserve">L’impostazione teorica di riferimento è quella di Vacchi et al. (2021)</w:t>
+      </w:r>
+      <w:r>
+        <w:rPr>
+          <w:rStyle w:val="FootnoteReference"/>
+        </w:rPr>
+        <w:footnoteReference w:id="84"/>
+      </w:r>
+      <w:r>
+        <w:t xml:space="preserve">, che ha</w:t>
+      </w:r>
+      <w:r>
+        <w:t xml:space="preserve"> </w:t>
+      </w:r>
+      <w:r>
+        <w:t xml:space="preserve">introdotto la visione quadridimensionale della sostenibilità (ambientale,</w:t>
+      </w:r>
+      <w:r>
+        <w:t xml:space="preserve"> </w:t>
+      </w:r>
+      <w:r>
+        <w:t xml:space="preserve">economica, sociale e</w:t>
       </w:r>
       <w:r>
         <w:t xml:space="preserve"> </w:t>
@@ -137,362 +418,60 @@
           <w:b/>
           <w:bCs/>
         </w:rPr>
-        <w:t xml:space="preserve">prodotto</w:t>
-      </w:r>
-      <w:r>
-        <w:t xml:space="preserve">, del</w:t>
-      </w:r>
-      <w:r>
-        <w:t xml:space="preserve"> </w:t>
-      </w:r>
-      <w:r>
-        <w:t xml:space="preserve">percorso di misurazione della sostenibilità tecnologica che il progetto START ha</w:t>
-      </w:r>
-      <w:r>
-        <w:t xml:space="preserve"> </w:t>
-      </w:r>
-      <w:r>
-        <w:t xml:space="preserve">sviluppato a livello di</w:t>
-      </w:r>
-      <w:r>
-        <w:t xml:space="preserve"> </w:t>
-      </w:r>
-      <w:r>
-        <w:rPr>
-          <w:b/>
-          <w:bCs/>
-        </w:rPr>
-        <w:t xml:space="preserve">processo/fabbrica</w:t>
-      </w:r>
-      <w:r>
-        <w:t xml:space="preserve"> </w:t>
-      </w:r>
-      <w:r>
-        <w:t xml:space="preserve">con l’attività 7.3. Mentre l’OR7.3</w:t>
-      </w:r>
-      <w:r>
-        <w:t xml:space="preserve"> </w:t>
-      </w:r>
-      <w:r>
-        <w:t xml:space="preserve">determina, attraverso l’</w:t>
+        <w:t xml:space="preserve">tecnologica</w:t>
+      </w:r>
+      <w:r>
+        <w:t xml:space="preserve">) e ha formalizzato il P-TSA come declinazione</w:t>
+      </w:r>
+      <w:r>
+        <w:t xml:space="preserve"> </w:t>
+      </w:r>
+      <w:r>
+        <w:t xml:space="preserve">“di prodotto/processo”</w:t>
+      </w:r>
+      <w:r>
+        <w:t xml:space="preserve"> </w:t>
+      </w:r>
+      <w:r>
+        <w:t xml:space="preserve">della</w:t>
+      </w:r>
+      <w:r>
+        <w:t xml:space="preserve"> </w:t>
       </w:r>
       <w:r>
         <w:rPr>
           <w:i/>
           <w:iCs/>
         </w:rPr>
-        <w:t xml:space="preserve">Extended Exergy Accounting Plus</w:t>
-      </w:r>
-      <w:r>
-        <w:t xml:space="preserve"> </w:t>
-      </w:r>
-      <w:r>
-        <w:t xml:space="preserve">(EEA+), un indice</w:t>
-      </w:r>
-      <w:r>
-        <w:t xml:space="preserve"> </w:t>
-      </w:r>
-      <w:r>
-        <w:t xml:space="preserve">termodinamico di sostenibilità (TSI) che sintetizza le prestazioni ambientali,</w:t>
-      </w:r>
-      <w:r>
-        <w:t xml:space="preserve"> </w:t>
-      </w:r>
-      <w:r>
-        <w:t xml:space="preserve">economiche, sociali e tecnologiche del sistema produttivo, l’OR7.4 sposta il</w:t>
-      </w:r>
-      <w:r>
-        <w:t xml:space="preserve"> </w:t>
-      </w:r>
-      <w:r>
-        <w:t xml:space="preserve">fuoco di analisi sul manufatto ceramico e ne quantifica la</w:t>
-      </w:r>
-      <w:r>
-        <w:t xml:space="preserve"> </w:t>
-      </w:r>
-      <w:r>
-        <w:rPr>
-          <w:b/>
-          <w:bCs/>
-        </w:rPr>
-        <w:t xml:space="preserve">sostenibilità</w:t>
-      </w:r>
-      <w:r>
-        <w:rPr>
-          <w:b/>
-          <w:bCs/>
-        </w:rPr>
-        <w:t xml:space="preserve"> </w:t>
-      </w:r>
-      <w:r>
-        <w:rPr>
-          <w:b/>
-          <w:bCs/>
-        </w:rPr>
-        <w:t xml:space="preserve">tecnologica</w:t>
-      </w:r>
-      <w:r>
-        <w:t xml:space="preserve">, ossia la capacità del sistema-prodotto di mantenere nel tempo</w:t>
-      </w:r>
-      <w:r>
-        <w:t xml:space="preserve"> </w:t>
-      </w:r>
-      <w:r>
-        <w:t xml:space="preserve">prestazioni operative e conformità normativa lungo l’intera catena del valore.</w:t>
+        <w:t xml:space="preserve">Technological Sustainability Assessment</w:t>
+      </w:r>
+      <w:r>
+        <w:t xml:space="preserve">; la</w:t>
+      </w:r>
+      <w:r>
+        <w:t xml:space="preserve"> </w:t>
+      </w:r>
+      <w:r>
+        <w:t xml:space="preserve">validazione operativa data-driven del quadro (variante organizzativa O-TSA) è</w:t>
+      </w:r>
+      <w:r>
+        <w:t xml:space="preserve"> </w:t>
+      </w:r>
+      <w:r>
+        <w:t xml:space="preserve">documentata in Vacchi, Settembre-Blundo et al. (2025)</w:t>
+      </w:r>
+      <w:r>
+        <w:rPr>
+          <w:rStyle w:val="FootnoteReference"/>
+        </w:rPr>
+        <w:footnoteReference w:id="85"/>
+      </w:r>
+      <w:r>
+        <w:t xml:space="preserve">.</w:t>
       </w:r>
     </w:p>
-    <w:p>
-      <w:pPr>
-        <w:pStyle w:val="BodyText"/>
-      </w:pPr>
-      <w:r>
-        <w:t xml:space="preserve">Il Piano di Sviluppo assegna all’attività l’applicazione della metodologia</w:t>
-      </w:r>
-      <w:r>
-        <w:t xml:space="preserve"> </w:t>
-      </w:r>
-      <w:r>
-        <w:rPr>
-          <w:b/>
-          <w:bCs/>
-        </w:rPr>
-        <w:t xml:space="preserve">P-TSA</w:t>
-      </w:r>
-      <w:r>
-        <w:t xml:space="preserve"> </w:t>
-      </w:r>
-      <w:r>
-        <w:t xml:space="preserve">secondo l’approccio del ciclo di vita (</w:t>
-      </w:r>
-      <w:r>
-        <w:rPr>
-          <w:i/>
-          <w:iCs/>
-        </w:rPr>
-        <w:t xml:space="preserve">Life Cycle Thinking</w:t>
-      </w:r>
-      <w:r>
-        <w:t xml:space="preserve">, LCT) e lo</w:t>
-      </w:r>
-      <w:r>
-        <w:t xml:space="preserve"> </w:t>
-      </w:r>
-      <w:r>
-        <w:t xml:space="preserve">schema operativo della norma</w:t>
-      </w:r>
-      <w:r>
-        <w:t xml:space="preserve"> </w:t>
-      </w:r>
-      <w:r>
-        <w:rPr>
-          <w:b/>
-          <w:bCs/>
-        </w:rPr>
-        <w:t xml:space="preserve">ISO 14040</w:t>
-      </w:r>
-      <w:r>
-        <w:t xml:space="preserve">, adottando una prospettiva di supply</w:t>
-      </w:r>
-      <w:r>
-        <w:t xml:space="preserve"> </w:t>
-      </w:r>
-      <w:r>
-        <w:t xml:space="preserve">chain</w:t>
-      </w:r>
-      <w:r>
-        <w:t xml:space="preserve"> </w:t>
-      </w:r>
-      <w:r>
-        <w:rPr>
-          <w:b/>
-          <w:bCs/>
-        </w:rPr>
-        <w:t xml:space="preserve">cradle-to-grave</w:t>
-      </w:r>
-      <w:r>
-        <w:t xml:space="preserve">. La sostenibilità tecnologica del prodotto è misurata</w:t>
-      </w:r>
-      <w:r>
-        <w:t xml:space="preserve"> </w:t>
-      </w:r>
-      <w:r>
-        <w:t xml:space="preserve">rispetto a tre categorie d’impatto tecnologico —</w:t>
-      </w:r>
-      <w:r>
-        <w:t xml:space="preserve"> </w:t>
-      </w:r>
-      <w:r>
-        <w:rPr>
-          <w:b/>
-          <w:bCs/>
-        </w:rPr>
-        <w:t xml:space="preserve">In-/Outputs Availability</w:t>
-      </w:r>
-      <w:r>
-        <w:rPr>
-          <w:b/>
-          <w:bCs/>
-        </w:rPr>
-        <w:t xml:space="preserve"> </w:t>
-      </w:r>
-      <w:r>
-        <w:rPr>
-          <w:b/>
-          <w:bCs/>
-        </w:rPr>
-        <w:t xml:space="preserve">(IOA)</w:t>
-      </w:r>
-      <w:r>
-        <w:t xml:space="preserve">,</w:t>
-      </w:r>
-      <w:r>
-        <w:t xml:space="preserve"> </w:t>
-      </w:r>
-      <w:r>
-        <w:rPr>
-          <w:b/>
-          <w:bCs/>
-        </w:rPr>
-        <w:t xml:space="preserve">Operational Performance (OP)</w:t>
-      </w:r>
-      <w:r>
-        <w:t xml:space="preserve"> </w:t>
-      </w:r>
-      <w:r>
-        <w:t xml:space="preserve">e</w:t>
-      </w:r>
-      <w:r>
-        <w:t xml:space="preserve"> </w:t>
-      </w:r>
-      <w:r>
-        <w:rPr>
-          <w:b/>
-          <w:bCs/>
-        </w:rPr>
-        <w:t xml:space="preserve">Technical Quality (TQ)</w:t>
-      </w:r>
-      <w:r>
-        <w:t xml:space="preserve"> </w:t>
-      </w:r>
-      <w:r>
-        <w:t xml:space="preserve">— combinando</w:t>
-      </w:r>
-      <w:r>
-        <w:t xml:space="preserve"> </w:t>
-      </w:r>
-      <w:r>
-        <w:t xml:space="preserve">metriche elementari in indicatori e, per aggregazione e normalizzazione, in un</w:t>
-      </w:r>
-      <w:r>
-        <w:t xml:space="preserve"> </w:t>
-      </w:r>
-      <w:r>
-        <w:t xml:space="preserve">indice sintetico, il</w:t>
-      </w:r>
-      <w:r>
-        <w:t xml:space="preserve"> </w:t>
-      </w:r>
-      <w:r>
-        <w:rPr>
-          <w:b/>
-          <w:bCs/>
-        </w:rPr>
-        <w:t xml:space="preserve">Product Technology Sustainability Index (P-TSI)</w:t>
-      </w:r>
-      <w:r>
-        <w:t xml:space="preserve">.</w:t>
-      </w:r>
-    </w:p>
-    <w:p>
-      <w:pPr>
-        <w:pStyle w:val="BodyText"/>
-      </w:pPr>
-      <w:r>
-        <w:t xml:space="preserve">L’impostazione teorica di riferimento è quella di Vacchi et al. (2021)</w:t>
-      </w:r>
-      <w:r>
-        <w:rPr>
-          <w:rStyle w:val="FootnoteReference"/>
-        </w:rPr>
-        <w:footnoteReference w:id="24"/>
-      </w:r>
-      <w:r>
-        <w:t xml:space="preserve">, che ha</w:t>
-      </w:r>
-      <w:r>
-        <w:t xml:space="preserve"> </w:t>
-      </w:r>
-      <w:r>
-        <w:t xml:space="preserve">introdotto la visione quadridimensionale della sostenibilità (ambientale,</w:t>
-      </w:r>
-      <w:r>
-        <w:t xml:space="preserve"> </w:t>
-      </w:r>
-      <w:r>
-        <w:t xml:space="preserve">economica, sociale e</w:t>
-      </w:r>
-      <w:r>
-        <w:t xml:space="preserve"> </w:t>
-      </w:r>
-      <w:r>
-        <w:rPr>
-          <w:b/>
-          <w:bCs/>
-        </w:rPr>
-        <w:t xml:space="preserve">tecnologica</w:t>
-      </w:r>
-      <w:r>
-        <w:t xml:space="preserve">) e ha formalizzato il P-TSA come declinazione</w:t>
-      </w:r>
-      <w:r>
-        <w:t xml:space="preserve"> </w:t>
-      </w:r>
-      <w:r>
-        <w:t xml:space="preserve">“di prodotto/processo”</w:t>
-      </w:r>
-      <w:r>
-        <w:t xml:space="preserve"> </w:t>
-      </w:r>
-      <w:r>
-        <w:t xml:space="preserve">della</w:t>
-      </w:r>
-      <w:r>
-        <w:t xml:space="preserve"> </w:t>
-      </w:r>
-      <w:r>
-        <w:rPr>
-          <w:i/>
-          <w:iCs/>
-        </w:rPr>
-        <w:t xml:space="preserve">Technological Sustainability Assessment</w:t>
-      </w:r>
-      <w:r>
-        <w:t xml:space="preserve">; la</w:t>
-      </w:r>
-      <w:r>
-        <w:t xml:space="preserve"> </w:t>
-      </w:r>
-      <w:r>
-        <w:t xml:space="preserve">validazione operativa data-driven del quadro (variante organizzativa O-TSA) è</w:t>
-      </w:r>
-      <w:r>
-        <w:t xml:space="preserve"> </w:t>
-      </w:r>
-      <w:r>
-        <w:t xml:space="preserve">documentata in Vacchi, Settembre-Blundo et al. (2025)</w:t>
-      </w:r>
-      <w:r>
-        <w:rPr>
-          <w:rStyle w:val="FootnoteReference"/>
-        </w:rPr>
-        <w:footnoteReference w:id="25"/>
-      </w:r>
-      <w:r>
-        <w:t xml:space="preserve">.</w:t>
-      </w:r>
-    </w:p>
-    <w:bookmarkEnd w:id="26"/>
-    <w:bookmarkStart w:id="27" w:name="baseline-e-scopi-dellattività"/>
+    <w:bookmarkEnd w:id="86"/>
+    <w:bookmarkStart w:id="87" w:name="baseline-e-scopi-dellattività"/>
     <w:p>
       <w:pPr>
         <w:pStyle w:val="Heading3"/>
@@ -791,73 +770,109 @@
           <w:tblHeader w:val="on"/>
         </w:trPr>
         <w:tc>
-          <w:tcPr/>
+          <w:tcPr>
+            <w:shd w:val="clear" w:color="auto" w:fill="0B5A3C"/>
+          </w:tcPr>
           <w:p>
             <w:pPr>
               <w:pStyle w:val="Compact"/>
               <w:jc w:val="left"/>
             </w:pPr>
             <w:r>
+              <w:rPr>
+                <w:b/>
+                <w:color w:val="FFFFFF"/>
+              </w:rPr>
               <w:t xml:space="preserve">Tipologia</w:t>
             </w:r>
           </w:p>
         </w:tc>
         <w:tc>
-          <w:tcPr/>
+          <w:tcPr>
+            <w:shd w:val="clear" w:color="auto" w:fill="0B5A3C"/>
+          </w:tcPr>
           <w:p>
             <w:pPr>
               <w:pStyle w:val="Compact"/>
               <w:jc w:val="center"/>
             </w:pPr>
             <w:r>
+              <w:rPr>
+                <w:b/>
+                <w:color w:val="FFFFFF"/>
+              </w:rPr>
               <w:t xml:space="preserve">Spessore</w:t>
             </w:r>
           </w:p>
         </w:tc>
         <w:tc>
-          <w:tcPr/>
+          <w:tcPr>
+            <w:shd w:val="clear" w:color="auto" w:fill="0B5A3C"/>
+          </w:tcPr>
           <w:p>
             <w:pPr>
               <w:pStyle w:val="Compact"/>
               <w:jc w:val="center"/>
             </w:pPr>
             <w:r>
+              <w:rPr>
+                <w:b/>
+                <w:color w:val="FFFFFF"/>
+              </w:rPr>
               <w:t xml:space="preserve">Massa (unità dichiarata)</w:t>
             </w:r>
           </w:p>
         </w:tc>
         <w:tc>
-          <w:tcPr/>
+          <w:tcPr>
+            <w:shd w:val="clear" w:color="auto" w:fill="0B5A3C"/>
+          </w:tcPr>
           <w:p>
             <w:pPr>
               <w:pStyle w:val="Compact"/>
               <w:jc w:val="left"/>
             </w:pPr>
             <w:r>
+              <w:rPr>
+                <w:b/>
+                <w:color w:val="FFFFFF"/>
+              </w:rPr>
               <w:t xml:space="preserve">Stabilimento</w:t>
             </w:r>
           </w:p>
         </w:tc>
         <w:tc>
-          <w:tcPr/>
+          <w:tcPr>
+            <w:shd w:val="clear" w:color="auto" w:fill="0B5A3C"/>
+          </w:tcPr>
           <w:p>
             <w:pPr>
               <w:pStyle w:val="Compact"/>
               <w:jc w:val="center"/>
             </w:pPr>
             <w:r>
+              <w:rPr>
+                <w:b/>
+                <w:color w:val="FFFFFF"/>
+              </w:rPr>
               <w:t xml:space="preserve">Gruppo</w:t>
             </w:r>
           </w:p>
         </w:tc>
         <w:tc>
-          <w:tcPr/>
+          <w:tcPr>
+            <w:shd w:val="clear" w:color="auto" w:fill="0B5A3C"/>
+          </w:tcPr>
           <w:p>
             <w:pPr>
               <w:pStyle w:val="Compact"/>
               <w:jc w:val="left"/>
             </w:pPr>
             <w:r>
+              <w:rPr>
+                <w:b/>
+                <w:color w:val="FFFFFF"/>
+              </w:rPr>
               <w:t xml:space="preserve">Uso tipico</w:t>
             </w:r>
           </w:p>
@@ -1098,8 +1113,8 @@
         </w:tc>
       </w:tr>
     </w:tbl>
-    <w:bookmarkEnd w:id="27"/>
-    <w:bookmarkStart w:id="28" w:name="interdipendenze-progettuali"/>
+    <w:bookmarkEnd w:id="87"/>
+    <w:bookmarkStart w:id="88" w:name="interdipendenze-progettuali"/>
     <w:p>
       <w:pPr>
         <w:pStyle w:val="Heading3"/>
@@ -1187,9 +1202,9 @@
         </w:pict>
       </w:r>
     </w:p>
-    <w:bookmarkEnd w:id="28"/>
-    <w:bookmarkEnd w:id="29"/>
-    <w:bookmarkStart w:id="41" w:name="metodologia"/>
+    <w:bookmarkEnd w:id="88"/>
+    <w:bookmarkEnd w:id="89"/>
+    <w:bookmarkStart w:id="101" w:name="metodologia"/>
     <w:p>
       <w:pPr>
         <w:pStyle w:val="Heading2"/>
@@ -1198,7 +1213,7 @@
         <w:t xml:space="preserve">2. METODOLOGIA</w:t>
       </w:r>
     </w:p>
-    <w:bookmarkStart w:id="30" w:name="Xaffa6f88de35cba920de798f87724ed919f0471"/>
+    <w:bookmarkStart w:id="90" w:name="Xaffa6f88de35cba920de798f87724ed919f0471"/>
     <w:p>
       <w:pPr>
         <w:pStyle w:val="Heading3"/>
@@ -1759,8 +1774,8 @@
         <w:t xml:space="preserve">qualità/conformità dell’output (TQ) lungo tutto il ciclo di vita.</w:t>
       </w:r>
     </w:p>
-    <w:bookmarkEnd w:id="30"/>
-    <w:bookmarkStart w:id="31" w:name="X288d999fd66b6d4cad38b2f107c97a2bbe6fd48"/>
+    <w:bookmarkEnd w:id="90"/>
+    <w:bookmarkStart w:id="91" w:name="X288d999fd66b6d4cad38b2f107c97a2bbe6fd48"/>
     <w:p>
       <w:pPr>
         <w:pStyle w:val="Heading3"/>
@@ -2062,8 +2077,8 @@
         <w:t xml:space="preserve">conformità normativa dei materiali ceramici.</w:t>
       </w:r>
     </w:p>
-    <w:bookmarkEnd w:id="31"/>
-    <w:bookmarkStart w:id="32" w:name="X0d9f85d9b6a976f37e8f4fa3e392c0140632b67"/>
+    <w:bookmarkEnd w:id="91"/>
+    <w:bookmarkStart w:id="92" w:name="X0d9f85d9b6a976f37e8f4fa3e392c0140632b67"/>
     <w:p>
       <w:pPr>
         <w:pStyle w:val="Heading3"/>
@@ -2391,8 +2406,8 @@
         <w:t xml:space="preserve">trasversale tra le tipologie e con OR7.3.</w:t>
       </w:r>
     </w:p>
-    <w:bookmarkEnd w:id="32"/>
-    <w:bookmarkStart w:id="33" w:name="X5f4ca89c1fc99b7dea943c4d3405b3f28298ab2"/>
+    <w:bookmarkEnd w:id="92"/>
+    <w:bookmarkStart w:id="93" w:name="X5f4ca89c1fc99b7dea943c4d3405b3f28298ab2"/>
     <w:p>
       <w:pPr>
         <w:pStyle w:val="Heading3"/>
@@ -3753,8 +3768,8 @@
         <w:t xml:space="preserve">di prima scelta).</w:t>
       </w:r>
     </w:p>
-    <w:bookmarkEnd w:id="33"/>
-    <w:bookmarkStart w:id="34" w:name="X2ef5ce14659128b0c334ef1114f183939699575"/>
+    <w:bookmarkEnd w:id="93"/>
+    <w:bookmarkStart w:id="94" w:name="X2ef5ce14659128b0c334ef1114f183939699575"/>
     <w:p>
       <w:pPr>
         <w:pStyle w:val="Heading3"/>
@@ -4428,8 +4443,8 @@
         <w:t xml:space="preserve">) adottata in OR7.3.</w:t>
       </w:r>
     </w:p>
-    <w:bookmarkEnd w:id="34"/>
-    <w:bookmarkStart w:id="36" w:name="X0a46dca5dd3862089c1adbd042787cd4c2aaa44"/>
+    <w:bookmarkEnd w:id="94"/>
+    <w:bookmarkStart w:id="96" w:name="X0a46dca5dd3862089c1adbd042787cd4c2aaa44"/>
     <w:p>
       <w:pPr>
         <w:pStyle w:val="Heading3"/>
@@ -5632,7 +5647,7 @@
         <w:rPr>
           <w:rStyle w:val="FootnoteReference"/>
         </w:rPr>
-        <w:footnoteReference w:id="35"/>
+        <w:footnoteReference w:id="95"/>
       </w:r>
       <w:r>
         <w:t xml:space="preserve"> </w:t>
@@ -5647,8 +5662,8 @@
         <w:t xml:space="preserve">massima trasparenza.</w:t>
       </w:r>
     </w:p>
-    <w:bookmarkEnd w:id="36"/>
-    <w:bookmarkStart w:id="38" w:name="X5fc334179c0c54224f30f53c65521be3b685818"/>
+    <w:bookmarkEnd w:id="96"/>
+    <w:bookmarkStart w:id="98" w:name="X5fc334179c0c54224f30f53c65521be3b685818"/>
     <w:p>
       <w:pPr>
         <w:pStyle w:val="Heading3"/>
@@ -5674,7 +5689,7 @@
         <w:rPr>
           <w:rStyle w:val="FootnoteReference"/>
         </w:rPr>
-        <w:footnoteReference w:id="37"/>
+        <w:footnoteReference w:id="97"/>
       </w:r>
       <w:r>
         <w:t xml:space="preserve"> </w:t>
@@ -7053,8 +7068,8 @@
         <w:t xml:space="preserve">).</w:t>
       </w:r>
     </w:p>
-    <w:bookmarkEnd w:id="38"/>
-    <w:bookmarkStart w:id="39" w:name="X9b15860280cf470b58db83cb3449d9b4818515f"/>
+    <w:bookmarkEnd w:id="98"/>
+    <w:bookmarkStart w:id="99" w:name="X9b15860280cf470b58db83cb3449d9b4818515f"/>
     <w:p>
       <w:pPr>
         <w:pStyle w:val="Heading3"/>
@@ -7376,8 +7391,8 @@
         <w:t xml:space="preserve">mesi di monitoraggio del collaudo.</w:t>
       </w:r>
     </w:p>
-    <w:bookmarkEnd w:id="39"/>
-    <w:bookmarkStart w:id="40" w:name="architettura-dei-dati-e-governance"/>
+    <w:bookmarkEnd w:id="99"/>
+    <w:bookmarkStart w:id="100" w:name="architettura-dei-dati-e-governance"/>
     <w:p>
       <w:pPr>
         <w:pStyle w:val="Heading3"/>
@@ -7502,9 +7517,9 @@
         </w:pict>
       </w:r>
     </w:p>
-    <w:bookmarkEnd w:id="40"/>
-    <w:bookmarkEnd w:id="41"/>
-    <w:bookmarkStart w:id="54" w:name="risultati"/>
+    <w:bookmarkEnd w:id="100"/>
+    <w:bookmarkEnd w:id="101"/>
+    <w:bookmarkStart w:id="114" w:name="risultati"/>
     <w:p>
       <w:pPr>
         <w:pStyle w:val="Heading2"/>
@@ -7513,7 +7528,7 @@
         <w:t xml:space="preserve">3. RISULTATI</w:t>
       </w:r>
     </w:p>
-    <w:bookmarkStart w:id="42" w:name="intensità-energetica-di-processo"/>
+    <w:bookmarkStart w:id="102" w:name="intensità-energetica-di-processo"/>
     <w:p>
       <w:pPr>
         <w:pStyle w:val="Heading3"/>
@@ -7603,37 +7618,55 @@
           <w:tblHeader w:val="on"/>
         </w:trPr>
         <w:tc>
-          <w:tcPr/>
+          <w:tcPr>
+            <w:shd w:val="clear" w:color="auto" w:fill="0B5A3C"/>
+          </w:tcPr>
           <w:p>
             <w:pPr>
               <w:pStyle w:val="Compact"/>
               <w:jc w:val="left"/>
             </w:pPr>
             <w:r>
+              <w:rPr>
+                <w:b/>
+                <w:color w:val="FFFFFF"/>
+              </w:rPr>
               <w:t xml:space="preserve">Tipologia</w:t>
             </w:r>
           </w:p>
         </w:tc>
         <w:tc>
-          <w:tcPr/>
+          <w:tcPr>
+            <w:shd w:val="clear" w:color="auto" w:fill="0B5A3C"/>
+          </w:tcPr>
           <w:p>
             <w:pPr>
               <w:pStyle w:val="Compact"/>
               <w:jc w:val="center"/>
             </w:pPr>
             <w:r>
+              <w:rPr>
+                <w:b/>
+                <w:color w:val="FFFFFF"/>
+              </w:rPr>
               <w:t xml:space="preserve">Massa [kg/m²]</w:t>
             </w:r>
           </w:p>
         </w:tc>
         <w:tc>
-          <w:tcPr/>
+          <w:tcPr>
+            <w:shd w:val="clear" w:color="auto" w:fill="0B5A3C"/>
+          </w:tcPr>
           <w:p>
             <w:pPr>
               <w:pStyle w:val="Compact"/>
               <w:jc w:val="center"/>
             </w:pPr>
             <w:r>
+              <w:rPr>
+                <w:b/>
+                <w:color w:val="FFFFFF"/>
+              </w:rPr>
               <w:t xml:space="preserve">Energia specifica di processo [MJ/m²]</w:t>
             </w:r>
           </w:p>
@@ -7754,8 +7787,8 @@
         </w:tc>
       </w:tr>
     </w:tbl>
-    <w:bookmarkEnd w:id="42"/>
-    <w:bookmarkStart w:id="43" w:name="indicatori-per-categoria"/>
+    <w:bookmarkEnd w:id="102"/>
+    <w:bookmarkStart w:id="103" w:name="indicatori-per-categoria"/>
     <w:p>
       <w:pPr>
         <w:pStyle w:val="Heading3"/>
@@ -7817,49 +7850,73 @@
           <w:tblHeader w:val="on"/>
         </w:trPr>
         <w:tc>
-          <w:tcPr/>
+          <w:tcPr>
+            <w:shd w:val="clear" w:color="auto" w:fill="0B5A3C"/>
+          </w:tcPr>
           <w:p>
             <w:pPr>
               <w:pStyle w:val="Compact"/>
               <w:jc w:val="left"/>
             </w:pPr>
             <w:r>
+              <w:rPr>
+                <w:b/>
+                <w:color w:val="FFFFFF"/>
+              </w:rPr>
               <w:t xml:space="preserve">SCR — copertura scorte [giorni]</w:t>
             </w:r>
           </w:p>
         </w:tc>
         <w:tc>
-          <w:tcPr/>
+          <w:tcPr>
+            <w:shd w:val="clear" w:color="auto" w:fill="0B5A3C"/>
+          </w:tcPr>
           <w:p>
             <w:pPr>
               <w:pStyle w:val="Compact"/>
               <w:jc w:val="center"/>
             </w:pPr>
             <w:r>
+              <w:rPr>
+                <w:b/>
+                <w:color w:val="FFFFFF"/>
+              </w:rPr>
               <w:t xml:space="preserve">T1 · 7,4 mm</w:t>
             </w:r>
           </w:p>
         </w:tc>
         <w:tc>
-          <w:tcPr/>
+          <w:tcPr>
+            <w:shd w:val="clear" w:color="auto" w:fill="0B5A3C"/>
+          </w:tcPr>
           <w:p>
             <w:pPr>
               <w:pStyle w:val="Compact"/>
               <w:jc w:val="center"/>
             </w:pPr>
             <w:r>
+              <w:rPr>
+                <w:b/>
+                <w:color w:val="FFFFFF"/>
+              </w:rPr>
               <w:t xml:space="preserve">T2 · 8,2 mm</w:t>
             </w:r>
           </w:p>
         </w:tc>
         <w:tc>
-          <w:tcPr/>
+          <w:tcPr>
+            <w:shd w:val="clear" w:color="auto" w:fill="0B5A3C"/>
+          </w:tcPr>
           <w:p>
             <w:pPr>
               <w:pStyle w:val="Compact"/>
               <w:jc w:val="center"/>
             </w:pPr>
             <w:r>
+              <w:rPr>
+                <w:b/>
+                <w:color w:val="FFFFFF"/>
+              </w:rPr>
               <w:t xml:space="preserve">T3 · 20 mm</w:t>
             </w:r>
           </w:p>
@@ -8070,61 +8127,91 @@
           <w:tblHeader w:val="on"/>
         </w:trPr>
         <w:tc>
-          <w:tcPr/>
+          <w:tcPr>
+            <w:shd w:val="clear" w:color="auto" w:fill="0B5A3C"/>
+          </w:tcPr>
           <w:p>
             <w:pPr>
               <w:pStyle w:val="Compact"/>
               <w:jc w:val="left"/>
             </w:pPr>
             <w:r>
+              <w:rPr>
+                <w:b/>
+                <w:color w:val="FFFFFF"/>
+              </w:rPr>
               <w:t xml:space="preserve">PsI — produttività</w:t>
             </w:r>
           </w:p>
         </w:tc>
         <w:tc>
-          <w:tcPr/>
+          <w:tcPr>
+            <w:shd w:val="clear" w:color="auto" w:fill="0B5A3C"/>
+          </w:tcPr>
           <w:p>
             <w:pPr>
               <w:pStyle w:val="Compact"/>
               <w:jc w:val="center"/>
             </w:pPr>
             <w:r>
+              <w:rPr>
+                <w:b/>
+                <w:color w:val="FFFFFF"/>
+              </w:rPr>
               <w:t xml:space="preserve">Unità</w:t>
             </w:r>
           </w:p>
         </w:tc>
         <w:tc>
-          <w:tcPr/>
+          <w:tcPr>
+            <w:shd w:val="clear" w:color="auto" w:fill="0B5A3C"/>
+          </w:tcPr>
           <w:p>
             <w:pPr>
               <w:pStyle w:val="Compact"/>
               <w:jc w:val="center"/>
             </w:pPr>
             <w:r>
+              <w:rPr>
+                <w:b/>
+                <w:color w:val="FFFFFF"/>
+              </w:rPr>
               <w:t xml:space="preserve">T1 · 7,4 mm</w:t>
             </w:r>
           </w:p>
         </w:tc>
         <w:tc>
-          <w:tcPr/>
+          <w:tcPr>
+            <w:shd w:val="clear" w:color="auto" w:fill="0B5A3C"/>
+          </w:tcPr>
           <w:p>
             <w:pPr>
               <w:pStyle w:val="Compact"/>
               <w:jc w:val="center"/>
             </w:pPr>
             <w:r>
+              <w:rPr>
+                <w:b/>
+                <w:color w:val="FFFFFF"/>
+              </w:rPr>
               <w:t xml:space="preserve">T2 · 8,2 mm</w:t>
             </w:r>
           </w:p>
         </w:tc>
         <w:tc>
-          <w:tcPr/>
+          <w:tcPr>
+            <w:shd w:val="clear" w:color="auto" w:fill="0B5A3C"/>
+          </w:tcPr>
           <w:p>
             <w:pPr>
               <w:pStyle w:val="Compact"/>
               <w:jc w:val="center"/>
             </w:pPr>
             <w:r>
+              <w:rPr>
+                <w:b/>
+                <w:color w:val="FFFFFF"/>
+              </w:rPr>
               <w:t xml:space="preserve">T3 · 20 mm</w:t>
             </w:r>
           </w:p>
@@ -8389,16 +8476,26 @@
           <w:tblHeader w:val="on"/>
         </w:trPr>
         <w:tc>
-          <w:tcPr/>
+          <w:tcPr>
+            <w:shd w:val="clear" w:color="auto" w:fill="0B5A3C"/>
+          </w:tcPr>
           <w:p>
             <w:pPr>
               <w:pStyle w:val="Compact"/>
               <w:jc w:val="left"/>
             </w:pPr>
             <w:r>
+              <w:rPr>
+                <w:b/>
+                <w:color w:val="FFFFFF"/>
+              </w:rPr>
               <w:t xml:space="preserve">OCR</w:t>
             </w:r>
             <w:r>
+              <w:rPr>
+                <w:b/>
+                <w:color w:val="FFFFFF"/>
+              </w:rPr>
               <w:t xml:space="preserve"> </w:t>
             </w:r>
             <m:oMath>
@@ -8442,49 +8539,73 @@
           </w:p>
         </w:tc>
         <w:tc>
-          <w:tcPr/>
+          <w:tcPr>
+            <w:shd w:val="clear" w:color="auto" w:fill="0B5A3C"/>
+          </w:tcPr>
           <w:p>
             <w:pPr>
               <w:pStyle w:val="Compact"/>
               <w:jc w:val="left"/>
             </w:pPr>
             <w:r>
+              <w:rPr>
+                <w:b/>
+                <w:color w:val="FFFFFF"/>
+              </w:rPr>
               <w:t xml:space="preserve">Norma / soglia</w:t>
             </w:r>
           </w:p>
         </w:tc>
         <w:tc>
-          <w:tcPr/>
+          <w:tcPr>
+            <w:shd w:val="clear" w:color="auto" w:fill="0B5A3C"/>
+          </w:tcPr>
           <w:p>
             <w:pPr>
               <w:pStyle w:val="Compact"/>
               <w:jc w:val="center"/>
             </w:pPr>
             <w:r>
+              <w:rPr>
+                <w:b/>
+                <w:color w:val="FFFFFF"/>
+              </w:rPr>
               <w:t xml:space="preserve">T1 · 7,4 mm</w:t>
             </w:r>
           </w:p>
         </w:tc>
         <w:tc>
-          <w:tcPr/>
+          <w:tcPr>
+            <w:shd w:val="clear" w:color="auto" w:fill="0B5A3C"/>
+          </w:tcPr>
           <w:p>
             <w:pPr>
               <w:pStyle w:val="Compact"/>
               <w:jc w:val="center"/>
             </w:pPr>
             <w:r>
+              <w:rPr>
+                <w:b/>
+                <w:color w:val="FFFFFF"/>
+              </w:rPr>
               <w:t xml:space="preserve">T2 · 8,2 mm</w:t>
             </w:r>
           </w:p>
         </w:tc>
         <w:tc>
-          <w:tcPr/>
+          <w:tcPr>
+            <w:shd w:val="clear" w:color="auto" w:fill="0B5A3C"/>
+          </w:tcPr>
           <w:p>
             <w:pPr>
               <w:pStyle w:val="Compact"/>
               <w:jc w:val="center"/>
             </w:pPr>
             <w:r>
+              <w:rPr>
+                <w:b/>
+                <w:color w:val="FFFFFF"/>
+              </w:rPr>
               <w:t xml:space="preserve">T3 · 20 mm</w:t>
             </w:r>
           </w:p>
@@ -8781,8 +8902,8 @@
         </w:tc>
       </w:tr>
     </w:tbl>
-    <w:bookmarkEnd w:id="43"/>
-    <w:bookmarkStart w:id="47" w:name="X033f6a3f59a27f89e81539ecbd5c1c24fae52a1"/>
+    <w:bookmarkEnd w:id="103"/>
+    <w:bookmarkStart w:id="107" w:name="X033f6a3f59a27f89e81539ecbd5c1c24fae52a1"/>
     <w:p>
       <w:pPr>
         <w:pStyle w:val="Heading3"/>
@@ -8841,55 +8962,81 @@
           <w:tblHeader w:val="on"/>
         </w:trPr>
         <w:tc>
-          <w:tcPr/>
+          <w:tcPr>
+            <w:shd w:val="clear" w:color="auto" w:fill="0B5A3C"/>
+          </w:tcPr>
           <w:p>
             <w:pPr>
               <w:pStyle w:val="Compact"/>
               <w:jc w:val="left"/>
             </w:pPr>
             <w:r>
+              <w:rPr>
+                <w:b/>
+                <w:color w:val="FFFFFF"/>
+              </w:rPr>
               <w:t xml:space="preserve">Tipologia</w:t>
             </w:r>
           </w:p>
         </w:tc>
         <w:tc>
-          <w:tcPr/>
+          <w:tcPr>
+            <w:shd w:val="clear" w:color="auto" w:fill="0B5A3C"/>
+          </w:tcPr>
           <w:p>
             <w:pPr>
               <w:pStyle w:val="Compact"/>
               <w:jc w:val="center"/>
             </w:pPr>
             <w:r>
+              <w:rPr>
+                <w:b/>
+                <w:color w:val="FFFFFF"/>
+              </w:rPr>
               <w:t xml:space="preserve">IOAI (z)</w:t>
             </w:r>
           </w:p>
         </w:tc>
         <w:tc>
-          <w:tcPr/>
+          <w:tcPr>
+            <w:shd w:val="clear" w:color="auto" w:fill="0B5A3C"/>
+          </w:tcPr>
           <w:p>
             <w:pPr>
               <w:pStyle w:val="Compact"/>
               <w:jc w:val="center"/>
             </w:pPr>
             <w:r>
+              <w:rPr>
+                <w:b/>
+                <w:color w:val="FFFFFF"/>
+              </w:rPr>
               <w:t xml:space="preserve">OPI (z)</w:t>
             </w:r>
           </w:p>
         </w:tc>
         <w:tc>
-          <w:tcPr/>
+          <w:tcPr>
+            <w:shd w:val="clear" w:color="auto" w:fill="0B5A3C"/>
+          </w:tcPr>
           <w:p>
             <w:pPr>
               <w:pStyle w:val="Compact"/>
               <w:jc w:val="center"/>
             </w:pPr>
             <w:r>
+              <w:rPr>
+                <w:b/>
+                <w:color w:val="FFFFFF"/>
+              </w:rPr>
               <w:t xml:space="preserve">TQI (z)</w:t>
             </w:r>
           </w:p>
         </w:tc>
         <w:tc>
-          <w:tcPr/>
+          <w:tcPr>
+            <w:shd w:val="clear" w:color="auto" w:fill="0B5A3C"/>
+          </w:tcPr>
           <w:p>
             <w:pPr>
               <w:pStyle w:val="Compact"/>
@@ -8899,6 +9046,7 @@
               <w:rPr>
                 <w:b/>
                 <w:bCs/>
+                <w:color w:val="FFFFFF"/>
               </w:rPr>
               <w:t xml:space="preserve">P-TSI (z)</w:t>
             </w:r>
@@ -9113,18 +9261,18 @@
           <wp:inline>
             <wp:extent cx="4782820" cy="2697688"/>
             <wp:effectExtent b="0" l="0" r="0" t="0"/>
-            <wp:docPr descr="Figura 1 — Profilo dimensionale per tipologia (z-score): T3 forte su IOA e TQ, debole su OP; T1 profilo speculare (forte OP)." title="" id="45" name="Picture"/>
+            <wp:docPr descr="Figura 1 — Profilo dimensionale per tipologia (z-score): T3 forte su IOA e TQ, debole su OP; T1 profilo speculare (forte OP)." title="" id="105" name="Picture"/>
             <a:graphic>
               <a:graphicData uri="http://schemas.openxmlformats.org/drawingml/2006/picture">
                 <pic:pic>
                   <pic:nvPicPr>
-                    <pic:cNvPr descr="RP7.4_fig1_profilo_dimensionale.png" id="46" name="Picture"/>
+                    <pic:cNvPr descr="RP7.4_fig1_profilo_dimensionale.png" id="106" name="Picture"/>
                     <pic:cNvPicPr>
                       <a:picLocks noChangeArrowheads="1" noChangeAspect="1"/>
                     </pic:cNvPicPr>
                   </pic:nvPicPr>
                   <pic:blipFill>
-                    <a:blip r:embed="rId44"/>
+                    <a:blip r:embed="rId104"/>
                     <a:stretch>
                       <a:fillRect/>
                     </a:stretch>
@@ -9169,8 +9317,8 @@
         <w:t xml:space="preserve">— Profilo dimensionale per tipologia (z-score): T3 forte su IOA e TQ, debole su OP; T1 profilo speculare (forte OP).</w:t>
       </w:r>
     </w:p>
-    <w:bookmarkEnd w:id="47"/>
-    <w:bookmarkStart w:id="51" w:name="X9e54ea9254a727b8d18b1ac2e8acd4847cd77ca"/>
+    <w:bookmarkEnd w:id="107"/>
+    <w:bookmarkStart w:id="111" w:name="X9e54ea9254a727b8d18b1ac2e8acd4847cd77ca"/>
     <w:p>
       <w:pPr>
         <w:pStyle w:val="Heading3"/>
@@ -9536,55 +9684,81 @@
           <w:tblHeader w:val="on"/>
         </w:trPr>
         <w:tc>
-          <w:tcPr/>
+          <w:tcPr>
+            <w:shd w:val="clear" w:color="auto" w:fill="0B5A3C"/>
+          </w:tcPr>
           <w:p>
             <w:pPr>
               <w:pStyle w:val="Compact"/>
               <w:jc w:val="left"/>
             </w:pPr>
             <w:r>
+              <w:rPr>
+                <w:b/>
+                <w:color w:val="FFFFFF"/>
+              </w:rPr>
               <w:t xml:space="preserve">Tipologia</w:t>
             </w:r>
           </w:p>
         </w:tc>
         <w:tc>
-          <w:tcPr/>
+          <w:tcPr>
+            <w:shd w:val="clear" w:color="auto" w:fill="0B5A3C"/>
+          </w:tcPr>
           <w:p>
             <w:pPr>
               <w:pStyle w:val="Compact"/>
               <w:jc w:val="center"/>
             </w:pPr>
             <w:r>
+              <w:rPr>
+                <w:b/>
+                <w:color w:val="FFFFFF"/>
+              </w:rPr>
               <w:t xml:space="preserve">S_IOA [1–5]</w:t>
             </w:r>
           </w:p>
         </w:tc>
         <w:tc>
-          <w:tcPr/>
+          <w:tcPr>
+            <w:shd w:val="clear" w:color="auto" w:fill="0B5A3C"/>
+          </w:tcPr>
           <w:p>
             <w:pPr>
               <w:pStyle w:val="Compact"/>
               <w:jc w:val="center"/>
             </w:pPr>
             <w:r>
+              <w:rPr>
+                <w:b/>
+                <w:color w:val="FFFFFF"/>
+              </w:rPr>
               <w:t xml:space="preserve">S_OP [1–5]</w:t>
             </w:r>
           </w:p>
         </w:tc>
         <w:tc>
-          <w:tcPr/>
+          <w:tcPr>
+            <w:shd w:val="clear" w:color="auto" w:fill="0B5A3C"/>
+          </w:tcPr>
           <w:p>
             <w:pPr>
               <w:pStyle w:val="Compact"/>
               <w:jc w:val="center"/>
             </w:pPr>
             <w:r>
+              <w:rPr>
+                <w:b/>
+                <w:color w:val="FFFFFF"/>
+              </w:rPr>
               <w:t xml:space="preserve">S_TQ [1–5]</w:t>
             </w:r>
           </w:p>
         </w:tc>
         <w:tc>
-          <w:tcPr/>
+          <w:tcPr>
+            <w:shd w:val="clear" w:color="auto" w:fill="0B5A3C"/>
+          </w:tcPr>
           <w:p>
             <w:pPr>
               <w:pStyle w:val="Compact"/>
@@ -9594,13 +9768,16 @@
               <w:rPr>
                 <w:b/>
                 <w:bCs/>
+                <w:color w:val="FFFFFF"/>
               </w:rPr>
               <w:t xml:space="preserve">P-TSI [1–5]</w:t>
             </w:r>
           </w:p>
         </w:tc>
         <w:tc>
-          <w:tcPr/>
+          <w:tcPr>
+            <w:shd w:val="clear" w:color="auto" w:fill="0B5A3C"/>
+          </w:tcPr>
           <w:p>
             <w:pPr>
               <w:pStyle w:val="Compact"/>
@@ -9610,6 +9787,7 @@
               <w:rPr>
                 <w:b/>
                 <w:bCs/>
+                <w:color w:val="FFFFFF"/>
               </w:rPr>
               <w:t xml:space="preserve">TII</w:t>
             </w:r>
@@ -9860,18 +10038,18 @@
           <wp:inline>
             <wp:extent cx="4236212" cy="2752921"/>
             <wp:effectExtent b="0" l="0" r="0" t="0"/>
-            <wp:docPr descr="Figura 2 — P-TSI (scala 1–5) e miglioramento annuo (TII) per tipologia." title="" id="49" name="Picture"/>
+            <wp:docPr descr="Figura 2 — P-TSI (scala 1–5) e miglioramento annuo (TII) per tipologia." title="" id="109" name="Picture"/>
             <a:graphic>
               <a:graphicData uri="http://schemas.openxmlformats.org/drawingml/2006/picture">
                 <pic:pic>
                   <pic:nvPicPr>
-                    <pic:cNvPr descr="RP7.4_fig2_ptsi_tii.png" id="50" name="Picture"/>
+                    <pic:cNvPr descr="RP7.4_fig2_ptsi_tii.png" id="110" name="Picture"/>
                     <pic:cNvPicPr>
                       <a:picLocks noChangeArrowheads="1" noChangeAspect="1"/>
                     </pic:cNvPicPr>
                   </pic:nvPicPr>
                   <pic:blipFill>
-                    <a:blip r:embed="rId48"/>
+                    <a:blip r:embed="rId108"/>
                     <a:stretch>
                       <a:fillRect/>
                     </a:stretch>
@@ -9916,8 +10094,8 @@
         <w:t xml:space="preserve">— P-TSI (scala 1–5) e miglioramento annuo (TII) per tipologia.</w:t>
       </w:r>
     </w:p>
-    <w:bookmarkEnd w:id="51"/>
-    <w:bookmarkStart w:id="52" w:name="analisi-di-sensibilità"/>
+    <w:bookmarkEnd w:id="111"/>
+    <w:bookmarkStart w:id="112" w:name="analisi-di-sensibilità"/>
     <w:p>
       <w:pPr>
         <w:pStyle w:val="Heading3"/>
@@ -9960,25 +10138,37 @@
           <w:tblHeader w:val="on"/>
         </w:trPr>
         <w:tc>
-          <w:tcPr/>
+          <w:tcPr>
+            <w:shd w:val="clear" w:color="auto" w:fill="0B5A3C"/>
+          </w:tcPr>
           <w:p>
             <w:pPr>
               <w:pStyle w:val="Compact"/>
               <w:jc w:val="left"/>
             </w:pPr>
             <w:r>
+              <w:rPr>
+                <w:b/>
+                <w:color w:val="FFFFFF"/>
+              </w:rPr>
               <w:t xml:space="preserve">Scenario</w:t>
             </w:r>
           </w:p>
         </w:tc>
         <w:tc>
-          <w:tcPr/>
+          <w:tcPr>
+            <w:shd w:val="clear" w:color="auto" w:fill="0B5A3C"/>
+          </w:tcPr>
           <w:p>
             <w:pPr>
               <w:pStyle w:val="Compact"/>
               <w:jc w:val="left"/>
             </w:pPr>
             <w:r>
+              <w:rPr>
+                <w:b/>
+                <w:color w:val="FFFFFF"/>
+              </w:rPr>
               <w:t xml:space="preserve">Ordinamento</w:t>
             </w:r>
           </w:p>
@@ -10149,8 +10339,8 @@
         </w:tc>
       </w:tr>
     </w:tbl>
-    <w:bookmarkEnd w:id="52"/>
-    <w:bookmarkStart w:id="53" w:name="verifica-dei-kpi-di-attività"/>
+    <w:bookmarkEnd w:id="112"/>
+    <w:bookmarkStart w:id="113" w:name="verifica-dei-kpi-di-attività"/>
     <w:p>
       <w:pPr>
         <w:pStyle w:val="Heading3"/>
@@ -10196,49 +10386,73 @@
           <w:tblHeader w:val="on"/>
         </w:trPr>
         <w:tc>
-          <w:tcPr/>
+          <w:tcPr>
+            <w:shd w:val="clear" w:color="auto" w:fill="0B5A3C"/>
+          </w:tcPr>
           <w:p>
             <w:pPr>
               <w:pStyle w:val="Compact"/>
               <w:jc w:val="left"/>
             </w:pPr>
             <w:r>
+              <w:rPr>
+                <w:b/>
+                <w:color w:val="FFFFFF"/>
+              </w:rPr>
               <w:t xml:space="preserve">KPI</w:t>
             </w:r>
           </w:p>
         </w:tc>
         <w:tc>
-          <w:tcPr/>
+          <w:tcPr>
+            <w:shd w:val="clear" w:color="auto" w:fill="0B5A3C"/>
+          </w:tcPr>
           <w:p>
             <w:pPr>
               <w:pStyle w:val="Compact"/>
               <w:jc w:val="center"/>
             </w:pPr>
             <w:r>
+              <w:rPr>
+                <w:b/>
+                <w:color w:val="FFFFFF"/>
+              </w:rPr>
               <w:t xml:space="preserve">Baseline</w:t>
             </w:r>
           </w:p>
         </w:tc>
         <w:tc>
-          <w:tcPr/>
+          <w:tcPr>
+            <w:shd w:val="clear" w:color="auto" w:fill="0B5A3C"/>
+          </w:tcPr>
           <w:p>
             <w:pPr>
               <w:pStyle w:val="Compact"/>
               <w:jc w:val="left"/>
             </w:pPr>
             <w:r>
+              <w:rPr>
+                <w:b/>
+                <w:color w:val="FFFFFF"/>
+              </w:rPr>
               <w:t xml:space="preserve">Obiettivo</w:t>
             </w:r>
           </w:p>
         </w:tc>
         <w:tc>
-          <w:tcPr/>
+          <w:tcPr>
+            <w:shd w:val="clear" w:color="auto" w:fill="0B5A3C"/>
+          </w:tcPr>
           <w:p>
             <w:pPr>
               <w:pStyle w:val="Compact"/>
               <w:jc w:val="left"/>
             </w:pPr>
             <w:r>
+              <w:rPr>
+                <w:b/>
+                <w:color w:val="FFFFFF"/>
+              </w:rPr>
               <w:t xml:space="preserve">Risultato</w:t>
             </w:r>
           </w:p>
@@ -10570,9 +10784,9 @@
         </w:pict>
       </w:r>
     </w:p>
-    <w:bookmarkEnd w:id="53"/>
-    <w:bookmarkEnd w:id="54"/>
-    <w:bookmarkStart w:id="62" w:name="discussione-e-conclusioni"/>
+    <w:bookmarkEnd w:id="113"/>
+    <w:bookmarkEnd w:id="114"/>
+    <w:bookmarkStart w:id="122" w:name="discussione-e-conclusioni"/>
     <w:p>
       <w:pPr>
         <w:pStyle w:val="Heading2"/>
@@ -10581,7 +10795,7 @@
         <w:t xml:space="preserve">4. DISCUSSIONE E CONCLUSIONI</w:t>
       </w:r>
     </w:p>
-    <w:bookmarkStart w:id="55" w:name="lettura-dei-risultati"/>
+    <w:bookmarkStart w:id="115" w:name="lettura-dei-risultati"/>
     <w:p>
       <w:pPr>
         <w:pStyle w:val="Heading3"/>
@@ -11340,8 +11554,8 @@
         <w:t xml:space="preserve">all’anno precedente, massimo per T3.</w:t>
       </w:r>
     </w:p>
-    <w:bookmarkEnd w:id="55"/>
-    <w:bookmarkStart w:id="56" w:name="X48331fa1e4696deabd2e44177fc3e69b5912673"/>
+    <w:bookmarkEnd w:id="115"/>
+    <w:bookmarkStart w:id="116" w:name="X48331fa1e4696deabd2e44177fc3e69b5912673"/>
     <w:p>
       <w:pPr>
         <w:pStyle w:val="Heading3"/>
@@ -11659,8 +11873,8 @@
         <w:t xml:space="preserve">individuazione come priorità di intervento.</w:t>
       </w:r>
     </w:p>
-    <w:bookmarkEnd w:id="56"/>
-    <w:bookmarkStart w:id="57" w:name="interdipendenze-progettuali-1"/>
+    <w:bookmarkEnd w:id="116"/>
+    <w:bookmarkStart w:id="117" w:name="interdipendenze-progettuali-1"/>
     <w:p>
       <w:pPr>
         <w:pStyle w:val="Heading3"/>
@@ -11755,8 +11969,8 @@
         <w:t xml:space="preserve">estendendo al prodotto ciò che l’OR7.3 realizza per la fabbrica.</w:t>
       </w:r>
     </w:p>
-    <w:bookmarkEnd w:id="57"/>
-    <w:bookmarkStart w:id="58" w:name="X2d9efcb47712aa81677295ca6c1fae6d2574882"/>
+    <w:bookmarkEnd w:id="117"/>
+    <w:bookmarkStart w:id="118" w:name="X2d9efcb47712aa81677295ca6c1fae6d2574882"/>
     <w:p>
       <w:pPr>
         <w:pStyle w:val="Heading3"/>
@@ -12085,8 +12299,8 @@
         <w:t xml:space="preserve">trova equivalenti a livello di prodotto nel comparto ceramico.</w:t>
       </w:r>
     </w:p>
-    <w:bookmarkEnd w:id="58"/>
-    <w:bookmarkStart w:id="59" w:name="X6c5e02fd02f97d7fed4bf571e8d78063914ae6b"/>
+    <w:bookmarkEnd w:id="118"/>
+    <w:bookmarkStart w:id="119" w:name="X6c5e02fd02f97d7fed4bf571e8d78063914ae6b"/>
     <w:p>
       <w:pPr>
         <w:pStyle w:val="Heading3"/>
@@ -12231,8 +12445,8 @@
         <w:t xml:space="preserve">modelli di business orientati ai dati.</w:t>
       </w:r>
     </w:p>
-    <w:bookmarkEnd w:id="59"/>
-    <w:bookmarkStart w:id="60" w:name="significato-più-ampio-e-prospettive"/>
+    <w:bookmarkEnd w:id="119"/>
+    <w:bookmarkStart w:id="120" w:name="significato-più-ampio-e-prospettive"/>
     <w:p>
       <w:pPr>
         <w:pStyle w:val="Heading3"/>
@@ -12434,8 +12648,8 @@
         </w:pict>
       </w:r>
     </w:p>
-    <w:bookmarkEnd w:id="60"/>
-    <w:bookmarkStart w:id="61" w:name="allegati"/>
+    <w:bookmarkEnd w:id="120"/>
+    <w:bookmarkStart w:id="121" w:name="allegati"/>
     <w:p>
       <w:pPr>
         <w:pStyle w:val="Heading3"/>
@@ -12585,15 +12799,15 @@
         <w:t xml:space="preserve">.</w:t>
       </w:r>
     </w:p>
-    <w:bookmarkEnd w:id="61"/>
-    <w:bookmarkEnd w:id="62"/>
-    <w:bookmarkEnd w:id="63"/>
+    <w:bookmarkEnd w:id="121"/>
+    <w:bookmarkEnd w:id="122"/>
+    <w:bookmarkEnd w:id="123"/>
     <w:sectPr>
-      <w:headerReference r:id="rId12" w:type="default"/>
-      <w:footerReference r:id="rId13" w:type="default"/>
-      <w:headerReference r:id="rId14" w:type="first"/>
-      <w:footerReference r:id="rId15" w:type="first"/>
-      <w:pgSz w:code="9" w:h="16838" w:orient="portrait" w:w="11906"/>
+      <w:headerReference r:id="rId72" w:type="default"/>
+      <w:footerReference r:id="rId73" w:type="default"/>
+      <w:headerReference r:id="rId74" w:type="first"/>
+      <w:footerReference r:id="rId75" w:type="first"/>
+      <w:pgSz w:code="9" w:h="16838" w:w="11906"/>
       <w:pgMar w:bottom="1701" w:footer="567" w:gutter="0" w:header="567" w:left="567" w:right="567" w:top="1701"/>
       <w:cols w:space="708"/>
       <w:titlePg/>
@@ -12608,7 +12822,7 @@
 </file>
 
 <file path=word/footer1.xml><?xml version="1.0" encoding="utf-8"?>
-<w:ftr xmlns:wpc="http://schemas.microsoft.com/office/word/2010/wordprocessingCanvas" xmlns:cx="http://schemas.microsoft.com/office/drawing/2014/chartex" xmlns:cx1="http://schemas.microsoft.com/office/drawing/2015/9/8/chartex" xmlns:cx2="http://schemas.microsoft.com/office/drawing/2015/10/21/chartex" xmlns:cx3="http://schemas.microsoft.com/office/drawing/2016/5/9/chartex" xmlns:cx4="http://schemas.microsoft.com/office/drawing/2016/5/10/chartex" xmlns:cx5="http://schemas.microsoft.com/office/drawing/2016/5/11/chartex" xmlns:cx6="http://schemas.microsoft.com/office/drawing/2016/5/12/chartex" xmlns:cx7="http://schemas.microsoft.com/office/drawing/2016/5/13/chartex" xmlns:cx8="http://schemas.microsoft.com/office/drawing/2016/5/14/chartex" xmlns:mc="http://schemas.openxmlformats.org/markup-compatibility/2006" xmlns:aink="http://schemas.microsoft.com/office/drawing/2016/ink" xmlns:am3d="http://schemas.microsoft.com/office/drawing/2017/model3d" xmlns:o="urn:schemas-microsoft-com:office:office" xmlns:oel="http://schemas.microsoft.com/office/2019/extlst" xmlns:r="http://schemas.openxmlformats.org/officeDocument/2006/relationships" xmlns:m="http://schemas.openxmlformats.org/officeDocument/2006/math" xmlns:v="urn:schemas-microsoft-com:vml" xmlns:wp14="http://schemas.microsoft.com/office/word/2010/wordprocessingDrawing" xmlns:wp="http://schemas.openxmlformats.org/drawingml/2006/wordprocessingDrawing" xmlns:w10="urn:schemas-microsoft-com:office:word" xmlns:w="http://schemas.openxmlformats.org/wordprocessingml/2006/main" xmlns:w14="http://schemas.microsoft.com/office/word/2010/wordml" xmlns:w15="http://schemas.microsoft.com/office/word/2012/wordml" xmlns:w16cex="http://schemas.microsoft.com/office/word/2018/wordml/cex" xmlns:w16cid="http://schemas.microsoft.com/office/word/2016/wordml/cid" xmlns:w16="http://schemas.microsoft.com/office/word/2018/wordml" xmlns:w16du="http://schemas.microsoft.com/office/word/2023/wordml/word16du" xmlns:w16sdtdh="http://schemas.microsoft.com/office/word/2020/wordml/sdtdatahash" xmlns:w16se="http://schemas.microsoft.com/office/word/2015/wordml/symex" xmlns:wpg="http://schemas.microsoft.com/office/word/2010/wordprocessingGroup" xmlns:wpi="http://schemas.microsoft.com/office/word/2010/wordprocessingInk" xmlns:wne="http://schemas.microsoft.com/office/word/2006/wordml" xmlns:wps="http://schemas.microsoft.com/office/word/2010/wordprocessingShape" mc:Ignorable="w14 w15 w16se w16cid w16 w16cex w16sdtdh w16du wp14">
+<w:ftr xmlns:wpc="http://schemas.microsoft.com/office/word/2010/wordprocessingCanvas" xmlns:cx="http://schemas.microsoft.com/office/drawing/2014/chartex" xmlns:cx1="http://schemas.microsoft.com/office/drawing/2015/9/8/chartex" xmlns:cx2="http://schemas.microsoft.com/office/drawing/2015/10/21/chartex" xmlns:cx3="http://schemas.microsoft.com/office/drawing/2016/5/9/chartex" xmlns:cx4="http://schemas.microsoft.com/office/drawing/2016/5/10/chartex" xmlns:cx5="http://schemas.microsoft.com/office/drawing/2016/5/11/chartex" xmlns:cx6="http://schemas.microsoft.com/office/drawing/2016/5/12/chartex" xmlns:cx7="http://schemas.microsoft.com/office/drawing/2016/5/13/chartex" xmlns:cx8="http://schemas.microsoft.com/office/drawing/2016/5/14/chartex" xmlns:mc="http://schemas.openxmlformats.org/markup-compatibility/2006" xmlns:aink="http://schemas.microsoft.com/office/drawing/2016/ink" xmlns:am3d="http://schemas.microsoft.com/office/drawing/2017/model3d" xmlns:o="urn:schemas-microsoft-com:office:office" xmlns:oel="http://schemas.microsoft.com/office/2019/extlst" xmlns:r="http://schemas.openxmlformats.org/officeDocument/2006/relationships" xmlns:m="http://schemas.openxmlformats.org/officeDocument/2006/math" xmlns:v="urn:schemas-microsoft-com:vml" xmlns:wp14="http://schemas.microsoft.com/office/word/2010/wordprocessingDrawing" xmlns:wp="http://schemas.openxmlformats.org/drawingml/2006/wordprocessingDrawing" xmlns:w10="urn:schemas-microsoft-com:office:word" xmlns:w="http://schemas.openxmlformats.org/wordprocessingml/2006/main" xmlns:w14="http://schemas.microsoft.com/office/word/2010/wordml" xmlns:w15="http://schemas.microsoft.com/office/word/2012/wordml" xmlns:w16cei="http://schemas.microsoft.com/office/word/2026/wordml/cei" xmlns:w16cex="http://schemas.microsoft.com/office/word/2018/wordml/cex" xmlns:w16cid="http://schemas.microsoft.com/office/word/2016/wordml/cid" xmlns:w16="http://schemas.microsoft.com/office/word/2018/wordml" xmlns:w16du="http://schemas.microsoft.com/office/word/2023/wordml/word16du" xmlns:w16sdtdh="http://schemas.microsoft.com/office/word/2020/wordml/sdtdatahash" xmlns:w16sdtfl="http://schemas.microsoft.com/office/word/2024/wordml/sdtformatlock" xmlns:w16se="http://schemas.microsoft.com/office/word/2015/wordml/symex" xmlns:wpg="http://schemas.microsoft.com/office/word/2010/wordprocessingGroup" xmlns:wpi="http://schemas.microsoft.com/office/word/2010/wordprocessingInk" xmlns:wne="http://schemas.microsoft.com/office/word/2006/wordml" xmlns:wps="http://schemas.microsoft.com/office/word/2010/wordprocessingShape" mc:Ignorable="w14 w15 w16se w16cid w16 w16cex w16sdtdh w16sdtfl w16du wp14">
   <w:sdt>
     <w:sdtPr>
       <w:id w:val="-973605069"/>
@@ -12662,12 +12876,12 @@
 </file>
 
 <file path=word/footer2.xml><?xml version="1.0" encoding="utf-8"?>
-<w:ftr xmlns:wpc="http://schemas.microsoft.com/office/word/2010/wordprocessingCanvas" xmlns:cx="http://schemas.microsoft.com/office/drawing/2014/chartex" xmlns:cx1="http://schemas.microsoft.com/office/drawing/2015/9/8/chartex" xmlns:cx2="http://schemas.microsoft.com/office/drawing/2015/10/21/chartex" xmlns:cx3="http://schemas.microsoft.com/office/drawing/2016/5/9/chartex" xmlns:cx4="http://schemas.microsoft.com/office/drawing/2016/5/10/chartex" xmlns:cx5="http://schemas.microsoft.com/office/drawing/2016/5/11/chartex" xmlns:cx6="http://schemas.microsoft.com/office/drawing/2016/5/12/chartex" xmlns:cx7="http://schemas.microsoft.com/office/drawing/2016/5/13/chartex" xmlns:cx8="http://schemas.microsoft.com/office/drawing/2016/5/14/chartex" xmlns:mc="http://schemas.openxmlformats.org/markup-compatibility/2006" xmlns:aink="http://schemas.microsoft.com/office/drawing/2016/ink" xmlns:am3d="http://schemas.microsoft.com/office/drawing/2017/model3d" xmlns:o="urn:schemas-microsoft-com:office:office" xmlns:oel="http://schemas.microsoft.com/office/2019/extlst" xmlns:r="http://schemas.openxmlformats.org/officeDocument/2006/relationships" xmlns:m="http://schemas.openxmlformats.org/officeDocument/2006/math" xmlns:v="urn:schemas-microsoft-com:vml" xmlns:wp14="http://schemas.microsoft.com/office/word/2010/wordprocessingDrawing" xmlns:wp="http://schemas.openxmlformats.org/drawingml/2006/wordprocessingDrawing" xmlns:w10="urn:schemas-microsoft-com:office:word" xmlns:w="http://schemas.openxmlformats.org/wordprocessingml/2006/main" xmlns:w14="http://schemas.microsoft.com/office/word/2010/wordml" xmlns:w15="http://schemas.microsoft.com/office/word/2012/wordml" xmlns:w16cex="http://schemas.microsoft.com/office/word/2018/wordml/cex" xmlns:w16cid="http://schemas.microsoft.com/office/word/2016/wordml/cid" xmlns:w16="http://schemas.microsoft.com/office/word/2018/wordml" xmlns:w16du="http://schemas.microsoft.com/office/word/2023/wordml/word16du" xmlns:w16sdtdh="http://schemas.microsoft.com/office/word/2020/wordml/sdtdatahash" xmlns:w16se="http://schemas.microsoft.com/office/word/2015/wordml/symex" xmlns:wpg="http://schemas.microsoft.com/office/word/2010/wordprocessingGroup" xmlns:wpi="http://schemas.microsoft.com/office/word/2010/wordprocessingInk" xmlns:wne="http://schemas.microsoft.com/office/word/2006/wordml" xmlns:wps="http://schemas.microsoft.com/office/word/2010/wordprocessingShape" xmlns:a="http://schemas.openxmlformats.org/drawingml/2006/main" xmlns:a16="http://schemas.microsoft.com/office/drawing/2014/main" xmlns:pic="http://schemas.openxmlformats.org/drawingml/2006/picture" mc:Ignorable="w14 w15 w16se w16cid w16 w16cex w16sdtdh w16du wp14">
+<w:ftr xmlns:wpc="http://schemas.microsoft.com/office/word/2010/wordprocessingCanvas" xmlns:cx="http://schemas.microsoft.com/office/drawing/2014/chartex" xmlns:cx1="http://schemas.microsoft.com/office/drawing/2015/9/8/chartex" xmlns:cx2="http://schemas.microsoft.com/office/drawing/2015/10/21/chartex" xmlns:cx3="http://schemas.microsoft.com/office/drawing/2016/5/9/chartex" xmlns:cx4="http://schemas.microsoft.com/office/drawing/2016/5/10/chartex" xmlns:cx5="http://schemas.microsoft.com/office/drawing/2016/5/11/chartex" xmlns:cx6="http://schemas.microsoft.com/office/drawing/2016/5/12/chartex" xmlns:cx7="http://schemas.microsoft.com/office/drawing/2016/5/13/chartex" xmlns:cx8="http://schemas.microsoft.com/office/drawing/2016/5/14/chartex" xmlns:mc="http://schemas.openxmlformats.org/markup-compatibility/2006" xmlns:aink="http://schemas.microsoft.com/office/drawing/2016/ink" xmlns:am3d="http://schemas.microsoft.com/office/drawing/2017/model3d" xmlns:o="urn:schemas-microsoft-com:office:office" xmlns:oel="http://schemas.microsoft.com/office/2019/extlst" xmlns:r="http://schemas.openxmlformats.org/officeDocument/2006/relationships" xmlns:m="http://schemas.openxmlformats.org/officeDocument/2006/math" xmlns:v="urn:schemas-microsoft-com:vml" xmlns:wp14="http://schemas.microsoft.com/office/word/2010/wordprocessingDrawing" xmlns:wp="http://schemas.openxmlformats.org/drawingml/2006/wordprocessingDrawing" xmlns:w10="urn:schemas-microsoft-com:office:word" xmlns:w="http://schemas.openxmlformats.org/wordprocessingml/2006/main" xmlns:w14="http://schemas.microsoft.com/office/word/2010/wordml" xmlns:w15="http://schemas.microsoft.com/office/word/2012/wordml" xmlns:w16cei="http://schemas.microsoft.com/office/word/2026/wordml/cei" xmlns:w16cex="http://schemas.microsoft.com/office/word/2018/wordml/cex" xmlns:w16cid="http://schemas.microsoft.com/office/word/2016/wordml/cid" xmlns:w16="http://schemas.microsoft.com/office/word/2018/wordml" xmlns:w16du="http://schemas.microsoft.com/office/word/2023/wordml/word16du" xmlns:w16sdtdh="http://schemas.microsoft.com/office/word/2020/wordml/sdtdatahash" xmlns:w16sdtfl="http://schemas.microsoft.com/office/word/2024/wordml/sdtformatlock" xmlns:w16se="http://schemas.microsoft.com/office/word/2015/wordml/symex" xmlns:wpg="http://schemas.microsoft.com/office/word/2010/wordprocessingGroup" xmlns:wpi="http://schemas.microsoft.com/office/word/2010/wordprocessingInk" xmlns:wne="http://schemas.microsoft.com/office/word/2006/wordml" xmlns:wps="http://schemas.microsoft.com/office/word/2010/wordprocessingShape" mc:Ignorable="w14 w15 w16se w16cid w16 w16cex w16sdtdh w16sdtfl w16du wp14">
   <w:p>
     <w:pPr>
       <w:pStyle w:val="Intestazione"/>
       <w:pBdr>
-        <w:bottom w:val="single" w:color="024C41" w:sz="18" w:space="1"/>
+        <w:bottom w:val="single" w:sz="18" w:space="1" w:color="024C41"/>
       </w:pBdr>
       <w:spacing w:before="60" w:after="240"/>
       <w:rPr>
@@ -12693,6 +12907,7 @@
     <w:r>
       <w:rPr>
         <w:rFonts w:asciiTheme="minorHAnsi" w:hAnsiTheme="minorHAnsi" w:cstheme="minorHAnsi"/>
+        <w:noProof/>
         <w:color w:val="00A98E"/>
         <w:sz w:val="28"/>
         <w:szCs w:val="36"/>
@@ -12701,7 +12916,7 @@
         <wp:inline distT="0" distB="0" distL="0" distR="0" wp14:anchorId="6B35C285" wp14:editId="14EFDE97">
           <wp:extent cx="6840220" cy="584835"/>
           <wp:effectExtent l="0" t="0" r="0" b="5715"/>
-          <wp:docPr id="27" name="Immagine 26">
+          <wp:docPr id="1401487893" name="Immagine 26">
             <a:extLst xmlns:a="http://schemas.openxmlformats.org/drawingml/2006/main">
               <a:ext uri="{FF2B5EF4-FFF2-40B4-BE49-F238E27FC236}">
                 <a16:creationId xmlns:a16="http://schemas.microsoft.com/office/drawing/2014/main" id="{534DBD57-FA8C-4557-94E5-9E23A699C807}"/>
@@ -12837,7 +13052,7 @@
       </w:r>
     </w:p>
   </w:footnote>
-  <w:footnote w:id="24">
+  <w:footnote w:id="84">
     <w:p>
       <w:pPr>
         <w:pStyle w:val="FootnoteText"/>
@@ -12872,7 +13087,7 @@
       </w:r>
     </w:p>
   </w:footnote>
-  <w:footnote w:id="25">
+  <w:footnote w:id="85">
     <w:p>
       <w:pPr>
         <w:pStyle w:val="FootnoteText"/>
@@ -12907,7 +13122,7 @@
       </w:r>
     </w:p>
   </w:footnote>
-  <w:footnote w:id="35">
+  <w:footnote w:id="95">
     <w:p>
       <w:pPr>
         <w:pStyle w:val="FootnoteText"/>
@@ -12942,7 +13157,7 @@
       </w:r>
     </w:p>
   </w:footnote>
-  <w:footnote w:id="37">
+  <w:footnote w:id="97">
     <w:p>
       <w:pPr>
         <w:pStyle w:val="FootnoteText"/>
@@ -12981,19 +13196,19 @@
 </file>
 
 <file path=word/header1.xml><?xml version="1.0" encoding="utf-8"?>
-<w:hdr xmlns:wpc="http://schemas.microsoft.com/office/word/2010/wordprocessingCanvas" xmlns:cx="http://schemas.microsoft.com/office/drawing/2014/chartex" xmlns:cx1="http://schemas.microsoft.com/office/drawing/2015/9/8/chartex" xmlns:cx2="http://schemas.microsoft.com/office/drawing/2015/10/21/chartex" xmlns:cx3="http://schemas.microsoft.com/office/drawing/2016/5/9/chartex" xmlns:cx4="http://schemas.microsoft.com/office/drawing/2016/5/10/chartex" xmlns:cx5="http://schemas.microsoft.com/office/drawing/2016/5/11/chartex" xmlns:cx6="http://schemas.microsoft.com/office/drawing/2016/5/12/chartex" xmlns:cx7="http://schemas.microsoft.com/office/drawing/2016/5/13/chartex" xmlns:cx8="http://schemas.microsoft.com/office/drawing/2016/5/14/chartex" xmlns:mc="http://schemas.openxmlformats.org/markup-compatibility/2006" xmlns:aink="http://schemas.microsoft.com/office/drawing/2016/ink" xmlns:am3d="http://schemas.microsoft.com/office/drawing/2017/model3d" xmlns:o="urn:schemas-microsoft-com:office:office" xmlns:oel="http://schemas.microsoft.com/office/2019/extlst" xmlns:r="http://schemas.openxmlformats.org/officeDocument/2006/relationships" xmlns:m="http://schemas.openxmlformats.org/officeDocument/2006/math" xmlns:v="urn:schemas-microsoft-com:vml" xmlns:wp14="http://schemas.microsoft.com/office/word/2010/wordprocessingDrawing" xmlns:wp="http://schemas.openxmlformats.org/drawingml/2006/wordprocessingDrawing" xmlns:w10="urn:schemas-microsoft-com:office:word" xmlns:w="http://schemas.openxmlformats.org/wordprocessingml/2006/main" xmlns:w14="http://schemas.microsoft.com/office/word/2010/wordml" xmlns:w15="http://schemas.microsoft.com/office/word/2012/wordml" xmlns:w16cex="http://schemas.microsoft.com/office/word/2018/wordml/cex" xmlns:w16cid="http://schemas.microsoft.com/office/word/2016/wordml/cid" xmlns:w16="http://schemas.microsoft.com/office/word/2018/wordml" xmlns:w16du="http://schemas.microsoft.com/office/word/2023/wordml/word16du" xmlns:w16sdtdh="http://schemas.microsoft.com/office/word/2020/wordml/sdtdatahash" xmlns:w16se="http://schemas.microsoft.com/office/word/2015/wordml/symex" xmlns:wpg="http://schemas.microsoft.com/office/word/2010/wordprocessingGroup" xmlns:wpi="http://schemas.microsoft.com/office/word/2010/wordprocessingInk" xmlns:wne="http://schemas.microsoft.com/office/word/2006/wordml" xmlns:wps="http://schemas.microsoft.com/office/word/2010/wordprocessingShape" xmlns:a="http://schemas.openxmlformats.org/drawingml/2006/main" xmlns:pic="http://schemas.openxmlformats.org/drawingml/2006/picture" mc:Ignorable="w14 w15 w16se w16cid w16 w16cex w16sdtdh w16du wp14">
+<w:hdr xmlns:wpc="http://schemas.microsoft.com/office/word/2010/wordprocessingCanvas" xmlns:cx="http://schemas.microsoft.com/office/drawing/2014/chartex" xmlns:cx1="http://schemas.microsoft.com/office/drawing/2015/9/8/chartex" xmlns:cx2="http://schemas.microsoft.com/office/drawing/2015/10/21/chartex" xmlns:cx3="http://schemas.microsoft.com/office/drawing/2016/5/9/chartex" xmlns:cx4="http://schemas.microsoft.com/office/drawing/2016/5/10/chartex" xmlns:cx5="http://schemas.microsoft.com/office/drawing/2016/5/11/chartex" xmlns:cx6="http://schemas.microsoft.com/office/drawing/2016/5/12/chartex" xmlns:cx7="http://schemas.microsoft.com/office/drawing/2016/5/13/chartex" xmlns:cx8="http://schemas.microsoft.com/office/drawing/2016/5/14/chartex" xmlns:mc="http://schemas.openxmlformats.org/markup-compatibility/2006" xmlns:aink="http://schemas.microsoft.com/office/drawing/2016/ink" xmlns:am3d="http://schemas.microsoft.com/office/drawing/2017/model3d" xmlns:o="urn:schemas-microsoft-com:office:office" xmlns:oel="http://schemas.microsoft.com/office/2019/extlst" xmlns:r="http://schemas.openxmlformats.org/officeDocument/2006/relationships" xmlns:m="http://schemas.openxmlformats.org/officeDocument/2006/math" xmlns:v="urn:schemas-microsoft-com:vml" xmlns:wp14="http://schemas.microsoft.com/office/word/2010/wordprocessingDrawing" xmlns:wp="http://schemas.openxmlformats.org/drawingml/2006/wordprocessingDrawing" xmlns:w10="urn:schemas-microsoft-com:office:word" xmlns:w="http://schemas.openxmlformats.org/wordprocessingml/2006/main" xmlns:w14="http://schemas.microsoft.com/office/word/2010/wordml" xmlns:w15="http://schemas.microsoft.com/office/word/2012/wordml" xmlns:w16cei="http://schemas.microsoft.com/office/word/2026/wordml/cei" xmlns:w16cex="http://schemas.microsoft.com/office/word/2018/wordml/cex" xmlns:w16cid="http://schemas.microsoft.com/office/word/2016/wordml/cid" xmlns:w16="http://schemas.microsoft.com/office/word/2018/wordml" xmlns:w16du="http://schemas.microsoft.com/office/word/2023/wordml/word16du" xmlns:w16sdtdh="http://schemas.microsoft.com/office/word/2020/wordml/sdtdatahash" xmlns:w16sdtfl="http://schemas.microsoft.com/office/word/2024/wordml/sdtformatlock" xmlns:w16se="http://schemas.microsoft.com/office/word/2015/wordml/symex" xmlns:wpg="http://schemas.microsoft.com/office/word/2010/wordprocessingGroup" xmlns:wpi="http://schemas.microsoft.com/office/word/2010/wordprocessingInk" xmlns:wne="http://schemas.microsoft.com/office/word/2006/wordml" xmlns:wps="http://schemas.microsoft.com/office/word/2010/wordprocessingShape" mc:Ignorable="w14 w15 w16se w16cid w16 w16cex w16sdtdh w16sdtfl w16du wp14">
   <w:tbl>
     <w:tblPr>
       <w:tblStyle w:val="Grigliatabella"/>
       <w:tblW w:w="10762" w:type="dxa"/>
       <w:tblInd w:w="-108" w:type="dxa"/>
       <w:tblBorders>
-        <w:top w:val="single" w:color="024C41" w:sz="18" w:space="0"/>
-        <w:left w:val="none" w:color="auto" w:sz="0" w:space="0"/>
-        <w:bottom w:val="single" w:color="024C41" w:sz="18" w:space="0"/>
-        <w:right w:val="none" w:color="auto" w:sz="0" w:space="0"/>
-        <w:insideH w:val="none" w:color="auto" w:sz="0" w:space="0"/>
-        <w:insideV w:val="none" w:color="auto" w:sz="0" w:space="0"/>
+        <w:top w:val="single" w:sz="18" w:space="0" w:color="024C41"/>
+        <w:left w:val="none" w:sz="0" w:space="0" w:color="auto"/>
+        <w:bottom w:val="single" w:sz="18" w:space="0" w:color="024C41"/>
+        <w:right w:val="none" w:sz="0" w:space="0" w:color="auto"/>
+        <w:insideH w:val="none" w:sz="0" w:space="0" w:color="auto"/>
+        <w:insideV w:val="none" w:sz="0" w:space="0" w:color="auto"/>
       </w:tblBorders>
       <w:tblLook w:val="04A0" w:firstRow="1" w:lastRow="0" w:firstColumn="1" w:lastColumn="0" w:noHBand="0" w:noVBand="1"/>
     </w:tblPr>
@@ -13243,18 +13458,18 @@
 </file>
 
 <file path=word/header2.xml><?xml version="1.0" encoding="utf-8"?>
-<w:hdr xmlns:wpc="http://schemas.microsoft.com/office/word/2010/wordprocessingCanvas" xmlns:cx="http://schemas.microsoft.com/office/drawing/2014/chartex" xmlns:cx1="http://schemas.microsoft.com/office/drawing/2015/9/8/chartex" xmlns:cx2="http://schemas.microsoft.com/office/drawing/2015/10/21/chartex" xmlns:cx3="http://schemas.microsoft.com/office/drawing/2016/5/9/chartex" xmlns:cx4="http://schemas.microsoft.com/office/drawing/2016/5/10/chartex" xmlns:cx5="http://schemas.microsoft.com/office/drawing/2016/5/11/chartex" xmlns:cx6="http://schemas.microsoft.com/office/drawing/2016/5/12/chartex" xmlns:cx7="http://schemas.microsoft.com/office/drawing/2016/5/13/chartex" xmlns:cx8="http://schemas.microsoft.com/office/drawing/2016/5/14/chartex" xmlns:mc="http://schemas.openxmlformats.org/markup-compatibility/2006" xmlns:aink="http://schemas.microsoft.com/office/drawing/2016/ink" xmlns:am3d="http://schemas.microsoft.com/office/drawing/2017/model3d" xmlns:o="urn:schemas-microsoft-com:office:office" xmlns:oel="http://schemas.microsoft.com/office/2019/extlst" xmlns:r="http://schemas.openxmlformats.org/officeDocument/2006/relationships" xmlns:m="http://schemas.openxmlformats.org/officeDocument/2006/math" xmlns:v="urn:schemas-microsoft-com:vml" xmlns:wp14="http://schemas.microsoft.com/office/word/2010/wordprocessingDrawing" xmlns:wp="http://schemas.openxmlformats.org/drawingml/2006/wordprocessingDrawing" xmlns:w10="urn:schemas-microsoft-com:office:word" xmlns:w="http://schemas.openxmlformats.org/wordprocessingml/2006/main" xmlns:w14="http://schemas.microsoft.com/office/word/2010/wordml" xmlns:w15="http://schemas.microsoft.com/office/word/2012/wordml" xmlns:w16cex="http://schemas.microsoft.com/office/word/2018/wordml/cex" xmlns:w16cid="http://schemas.microsoft.com/office/word/2016/wordml/cid" xmlns:w16="http://schemas.microsoft.com/office/word/2018/wordml" xmlns:w16du="http://schemas.microsoft.com/office/word/2023/wordml/word16du" xmlns:w16sdtdh="http://schemas.microsoft.com/office/word/2020/wordml/sdtdatahash" xmlns:w16se="http://schemas.microsoft.com/office/word/2015/wordml/symex" xmlns:wpg="http://schemas.microsoft.com/office/word/2010/wordprocessingGroup" xmlns:wpi="http://schemas.microsoft.com/office/word/2010/wordprocessingInk" xmlns:wne="http://schemas.microsoft.com/office/word/2006/wordml" xmlns:wps="http://schemas.microsoft.com/office/word/2010/wordprocessingShape" xmlns:a="http://schemas.openxmlformats.org/drawingml/2006/main" xmlns:pic="http://schemas.openxmlformats.org/drawingml/2006/picture" mc:Ignorable="w14 w15 w16se w16cid w16 w16cex w16sdtdh w16du wp14">
+<w:hdr xmlns:wpc="http://schemas.microsoft.com/office/word/2010/wordprocessingCanvas" xmlns:cx="http://schemas.microsoft.com/office/drawing/2014/chartex" xmlns:cx1="http://schemas.microsoft.com/office/drawing/2015/9/8/chartex" xmlns:cx2="http://schemas.microsoft.com/office/drawing/2015/10/21/chartex" xmlns:cx3="http://schemas.microsoft.com/office/drawing/2016/5/9/chartex" xmlns:cx4="http://schemas.microsoft.com/office/drawing/2016/5/10/chartex" xmlns:cx5="http://schemas.microsoft.com/office/drawing/2016/5/11/chartex" xmlns:cx6="http://schemas.microsoft.com/office/drawing/2016/5/12/chartex" xmlns:cx7="http://schemas.microsoft.com/office/drawing/2016/5/13/chartex" xmlns:cx8="http://schemas.microsoft.com/office/drawing/2016/5/14/chartex" xmlns:mc="http://schemas.openxmlformats.org/markup-compatibility/2006" xmlns:aink="http://schemas.microsoft.com/office/drawing/2016/ink" xmlns:am3d="http://schemas.microsoft.com/office/drawing/2017/model3d" xmlns:o="urn:schemas-microsoft-com:office:office" xmlns:oel="http://schemas.microsoft.com/office/2019/extlst" xmlns:r="http://schemas.openxmlformats.org/officeDocument/2006/relationships" xmlns:m="http://schemas.openxmlformats.org/officeDocument/2006/math" xmlns:v="urn:schemas-microsoft-com:vml" xmlns:wp14="http://schemas.microsoft.com/office/word/2010/wordprocessingDrawing" xmlns:wp="http://schemas.openxmlformats.org/drawingml/2006/wordprocessingDrawing" xmlns:w10="urn:schemas-microsoft-com:office:word" xmlns:w="http://schemas.openxmlformats.org/wordprocessingml/2006/main" xmlns:w14="http://schemas.microsoft.com/office/word/2010/wordml" xmlns:w15="http://schemas.microsoft.com/office/word/2012/wordml" xmlns:w16cei="http://schemas.microsoft.com/office/word/2026/wordml/cei" xmlns:w16cex="http://schemas.microsoft.com/office/word/2018/wordml/cex" xmlns:w16cid="http://schemas.microsoft.com/office/word/2016/wordml/cid" xmlns:w16="http://schemas.microsoft.com/office/word/2018/wordml" xmlns:w16du="http://schemas.microsoft.com/office/word/2023/wordml/word16du" xmlns:w16sdtdh="http://schemas.microsoft.com/office/word/2020/wordml/sdtdatahash" xmlns:w16sdtfl="http://schemas.microsoft.com/office/word/2024/wordml/sdtformatlock" xmlns:w16se="http://schemas.microsoft.com/office/word/2015/wordml/symex" xmlns:wpg="http://schemas.microsoft.com/office/word/2010/wordprocessingGroup" xmlns:wpi="http://schemas.microsoft.com/office/word/2010/wordprocessingInk" xmlns:wne="http://schemas.microsoft.com/office/word/2006/wordml" xmlns:wps="http://schemas.microsoft.com/office/word/2010/wordprocessingShape" mc:Ignorable="w14 w15 w16se w16cid w16 w16cex w16sdtdh w16sdtfl w16du wp14">
   <w:tbl>
     <w:tblPr>
       <w:tblStyle w:val="Grigliatabella"/>
       <w:tblW w:w="0" w:type="auto"/>
       <w:tblBorders>
-        <w:top w:val="single" w:color="024C41" w:sz="18" w:space="0"/>
-        <w:left w:val="none" w:color="auto" w:sz="0" w:space="0"/>
-        <w:bottom w:val="single" w:color="024C41" w:sz="18" w:space="0"/>
-        <w:right w:val="none" w:color="auto" w:sz="0" w:space="0"/>
-        <w:insideH w:val="none" w:color="auto" w:sz="0" w:space="0"/>
-        <w:insideV w:val="none" w:color="auto" w:sz="0" w:space="0"/>
+        <w:top w:val="single" w:sz="18" w:space="0" w:color="024C41"/>
+        <w:left w:val="none" w:sz="0" w:space="0" w:color="auto"/>
+        <w:bottom w:val="single" w:sz="18" w:space="0" w:color="024C41"/>
+        <w:right w:val="none" w:sz="0" w:space="0" w:color="auto"/>
+        <w:insideH w:val="none" w:sz="0" w:space="0" w:color="auto"/>
+        <w:insideV w:val="none" w:sz="0" w:space="0" w:color="auto"/>
       </w:tblBorders>
       <w:tblLook w:val="04A0" w:firstRow="1" w:lastRow="0" w:firstColumn="1" w:lastColumn="0" w:noHBand="0" w:noVBand="1"/>
     </w:tblPr>
@@ -13487,7 +13702,7 @@
 </file>
 
 <file path=word/numbering.xml><?xml version="1.0" encoding="utf-8"?>
-<w:numbering xmlns:aink="http://schemas.microsoft.com/office/drawing/2016/ink" xmlns:am3d="http://schemas.microsoft.com/office/drawing/2017/model3d" xmlns:cx="http://schemas.microsoft.com/office/drawing/2014/chartex" xmlns:cx1="http://schemas.microsoft.com/office/drawing/2015/9/8/chartex" xmlns:cx2="http://schemas.microsoft.com/office/drawing/2015/10/21/chartex" xmlns:cx3="http://schemas.microsoft.com/office/drawing/2016/5/9/chartex" xmlns:cx4="http://schemas.microsoft.com/office/drawing/2016/5/10/chartex" xmlns:cx5="http://schemas.microsoft.com/office/drawing/2016/5/11/chartex" xmlns:cx6="http://schemas.microsoft.com/office/drawing/2016/5/12/chartex" xmlns:cx7="http://schemas.microsoft.com/office/drawing/2016/5/13/chartex" xmlns:cx8="http://schemas.microsoft.com/office/drawing/2016/5/14/chartex" xmlns:m="http://schemas.openxmlformats.org/officeDocument/2006/math" xmlns:mc="http://schemas.openxmlformats.org/markup-compatibility/2006" xmlns:o="urn:schemas-microsoft-com:office:office" xmlns:oel="http://schemas.microsoft.com/office/2019/extlst" xmlns:r="http://schemas.openxmlformats.org/officeDocument/2006/relationships" xmlns:v="urn:schemas-microsoft-com:vml" xmlns:w="http://schemas.openxmlformats.org/wordprocessingml/2006/main" xmlns:w10="urn:schemas-microsoft-com:office:word" xmlns:w14="http://schemas.microsoft.com/office/word/2010/wordml" xmlns:w15="http://schemas.microsoft.com/office/word/2012/wordml" xmlns:w16="http://schemas.microsoft.com/office/word/2018/wordml" xmlns:w16cex="http://schemas.microsoft.com/office/word/2018/wordml/cex" xmlns:w16cid="http://schemas.microsoft.com/office/word/2016/wordml/cid" xmlns:w16du="http://schemas.microsoft.com/office/word/2023/wordml/word16du" xmlns:w16sdtdh="http://schemas.microsoft.com/office/word/2020/wordml/sdtdatahash" xmlns:w16se="http://schemas.microsoft.com/office/word/2015/wordml/symex" xmlns:wne="http://schemas.microsoft.com/office/word/2006/wordml" xmlns:wp="http://schemas.openxmlformats.org/drawingml/2006/wordprocessingDrawing" xmlns:wp14="http://schemas.microsoft.com/office/word/2010/wordprocessingDrawing" xmlns:wpc="http://schemas.microsoft.com/office/word/2010/wordprocessingCanvas" xmlns:wpg="http://schemas.microsoft.com/office/word/2010/wordprocessingGroup" xmlns:wpi="http://schemas.microsoft.com/office/word/2010/wordprocessingInk" xmlns:wps="http://schemas.microsoft.com/office/word/2010/wordprocessingShape" mc:Ignorable="w14 w15 w16se w16cid w16 w16cex w16sdtdh w16du wp14">
+<w:numbering xmlns:aink="http://schemas.microsoft.com/office/drawing/2016/ink" xmlns:am3d="http://schemas.microsoft.com/office/drawing/2017/model3d" xmlns:cx="http://schemas.microsoft.com/office/drawing/2014/chartex" xmlns:cx1="http://schemas.microsoft.com/office/drawing/2015/9/8/chartex" xmlns:cx2="http://schemas.microsoft.com/office/drawing/2015/10/21/chartex" xmlns:cx3="http://schemas.microsoft.com/office/drawing/2016/5/9/chartex" xmlns:cx4="http://schemas.microsoft.com/office/drawing/2016/5/10/chartex" xmlns:cx5="http://schemas.microsoft.com/office/drawing/2016/5/11/chartex" xmlns:cx6="http://schemas.microsoft.com/office/drawing/2016/5/12/chartex" xmlns:cx7="http://schemas.microsoft.com/office/drawing/2016/5/13/chartex" xmlns:cx8="http://schemas.microsoft.com/office/drawing/2016/5/14/chartex" xmlns:m="http://schemas.openxmlformats.org/officeDocument/2006/math" xmlns:mc="http://schemas.openxmlformats.org/markup-compatibility/2006" xmlns:o="urn:schemas-microsoft-com:office:office" xmlns:oel="http://schemas.microsoft.com/office/2019/extlst" xmlns:r="http://schemas.openxmlformats.org/officeDocument/2006/relationships" xmlns:v="urn:schemas-microsoft-com:vml" xmlns:w="http://schemas.openxmlformats.org/wordprocessingml/2006/main" xmlns:w10="urn:schemas-microsoft-com:office:word" xmlns:w14="http://schemas.microsoft.com/office/word/2010/wordml" xmlns:w15="http://schemas.microsoft.com/office/word/2012/wordml" xmlns:w16="http://schemas.microsoft.com/office/word/2018/wordml" xmlns:w16cei="http://schemas.microsoft.com/office/word/2026/wordml/cei" xmlns:w16cex="http://schemas.microsoft.com/office/word/2018/wordml/cex" xmlns:w16cid="http://schemas.microsoft.com/office/word/2016/wordml/cid" xmlns:w16du="http://schemas.microsoft.com/office/word/2023/wordml/word16du" xmlns:w16sdtdh="http://schemas.microsoft.com/office/word/2020/wordml/sdtdatahash" xmlns:w16sdtfl="http://schemas.microsoft.com/office/word/2024/wordml/sdtformatlock" xmlns:w16se="http://schemas.microsoft.com/office/word/2015/wordml/symex" xmlns:wne="http://schemas.microsoft.com/office/word/2006/wordml" xmlns:wp="http://schemas.openxmlformats.org/drawingml/2006/wordprocessingDrawing" xmlns:wp14="http://schemas.microsoft.com/office/word/2010/wordprocessingDrawing" xmlns:wpc="http://schemas.microsoft.com/office/word/2010/wordprocessingCanvas" xmlns:wpg="http://schemas.microsoft.com/office/word/2010/wordprocessingGroup" xmlns:wpi="http://schemas.microsoft.com/office/word/2010/wordprocessingInk" xmlns:wps="http://schemas.microsoft.com/office/word/2010/wordprocessingShape" mc:Ignorable="w14 w15 w16se w16cid w16 w16cex w16sdtdh w16sdtfl w16du wp14">
   <w:abstractNum w15:restartNumberingAfterBreak="0" w:abstractNumId="0">
     <w:nsid w:val="0CBD5014"/>
     <w:multiLevelType w:val="hybridMultilevel"/>
@@ -14531,7 +14746,7 @@
 </file>
 
 <file path=word/styles.xml><?xml version="1.0" encoding="utf-8"?>
-<w:styles xmlns:mc="http://schemas.openxmlformats.org/markup-compatibility/2006" xmlns:r="http://schemas.openxmlformats.org/officeDocument/2006/relationships" xmlns:w="http://schemas.openxmlformats.org/wordprocessingml/2006/main" xmlns:w14="http://schemas.microsoft.com/office/word/2010/wordml" xmlns:w15="http://schemas.microsoft.com/office/word/2012/wordml" xmlns:w16="http://schemas.microsoft.com/office/word/2018/wordml" xmlns:w16cex="http://schemas.microsoft.com/office/word/2018/wordml/cex" xmlns:w16cid="http://schemas.microsoft.com/office/word/2016/wordml/cid" xmlns:w16du="http://schemas.microsoft.com/office/word/2023/wordml/word16du" xmlns:w16sdtdh="http://schemas.microsoft.com/office/word/2020/wordml/sdtdatahash" xmlns:w16se="http://schemas.microsoft.com/office/word/2015/wordml/symex" mc:Ignorable="w14 w15 w16se w16cid w16 w16cex w16sdtdh w16du">
+<w:styles xmlns:mc="http://schemas.openxmlformats.org/markup-compatibility/2006" xmlns:r="http://schemas.openxmlformats.org/officeDocument/2006/relationships" xmlns:w="http://schemas.openxmlformats.org/wordprocessingml/2006/main" xmlns:w14="http://schemas.microsoft.com/office/word/2010/wordml" xmlns:w15="http://schemas.microsoft.com/office/word/2012/wordml" xmlns:w16="http://schemas.microsoft.com/office/word/2018/wordml" xmlns:w16cex="http://schemas.microsoft.com/office/word/2018/wordml/cex" xmlns:w16cid="http://schemas.microsoft.com/office/word/2016/wordml/cid" xmlns:w16du="http://schemas.microsoft.com/office/word/2023/wordml/word16du" xmlns:w16sdtdh="http://schemas.microsoft.com/office/word/2020/wordml/sdtdatahash" xmlns:w16sdtfl="http://schemas.microsoft.com/office/word/2024/wordml/sdtformatlock" xmlns:w16se="http://schemas.microsoft.com/office/word/2015/wordml/symex" mc:Ignorable="w14 w15 w16se w16cid w16 w16cex w16sdtdh w16sdtfl w16du">
   <w:docDefaults>
     <w:rPrDefault>
       <w:rPr>
@@ -15054,6 +15269,102 @@
       <w:u w:val="single"/>
     </w:rPr>
   </w:style>
+  <w:style w:styleId="Heading1" w:type="paragraph">
+    <w:name w:val="heading 1"/>
+    <w:basedOn w:val="Normale"/>
+    <w:next w:val="Normale"/>
+    <w:qFormat/>
+    <w:pPr>
+      <w:keepNext/>
+      <w:keepLines/>
+      <w:spacing w:after="120" w:before="240"/>
+      <w:jc w:val="center"/>
+      <w:outlineLvl w:val="0"/>
+    </w:pPr>
+    <w:rPr>
+      <w:rFonts w:ascii="Times New Roman" w:cs="Times New Roman" w:hAnsi="Times New Roman"/>
+      <w:b/>
+      <w:color w:val="024C41"/>
+      <w:sz w:val="40"/>
+      <w:szCs w:val="40"/>
+    </w:rPr>
+  </w:style>
+  <w:style w:styleId="Heading2" w:type="paragraph">
+    <w:name w:val="heading 2"/>
+    <w:basedOn w:val="Normale"/>
+    <w:next w:val="Normale"/>
+    <w:qFormat/>
+    <w:pPr>
+      <w:keepNext/>
+      <w:keepLines/>
+      <w:spacing w:after="120" w:before="240"/>
+      <w:outlineLvl w:val="1"/>
+    </w:pPr>
+    <w:rPr>
+      <w:rFonts w:ascii="Times New Roman" w:cs="Times New Roman" w:hAnsi="Times New Roman"/>
+      <w:b/>
+      <w:color w:val="024C41"/>
+      <w:sz w:val="32"/>
+      <w:szCs w:val="32"/>
+    </w:rPr>
+  </w:style>
+  <w:style w:styleId="Heading3" w:type="paragraph">
+    <w:name w:val="heading 3"/>
+    <w:basedOn w:val="Normale"/>
+    <w:next w:val="Normale"/>
+    <w:qFormat/>
+    <w:pPr>
+      <w:keepNext/>
+      <w:keepLines/>
+      <w:spacing w:after="120" w:before="240"/>
+      <w:outlineLvl w:val="2"/>
+    </w:pPr>
+    <w:rPr>
+      <w:rFonts w:ascii="Times New Roman" w:cs="Times New Roman" w:hAnsi="Times New Roman"/>
+      <w:b/>
+      <w:color w:val="024C41"/>
+      <w:sz w:val="26"/>
+      <w:szCs w:val="26"/>
+    </w:rPr>
+  </w:style>
+  <w:style w:styleId="Caption" w:type="paragraph">
+    <w:name w:val="Caption"/>
+    <w:basedOn w:val="Normale"/>
+    <w:qFormat/>
+    <w:pPr>
+      <w:spacing w:after="180" w:before="60"/>
+    </w:pPr>
+    <w:rPr>
+      <w:rFonts w:ascii="Times New Roman" w:cs="Times New Roman" w:hAnsi="Times New Roman"/>
+      <w:i/>
+      <w:color w:val="404040"/>
+      <w:sz w:val="18"/>
+      <w:szCs w:val="18"/>
+    </w:rPr>
+  </w:style>
+  <w:style w:styleId="Table" w:type="table">
+    <w:name w:val="Table"/>
+    <w:basedOn w:val="Tabellanormale"/>
+    <w:tblPr>
+      <w:tblBorders>
+        <w:top w:color="7F7F7F" w:space="0" w:sz="4" w:val="single"/>
+        <w:left w:color="7F7F7F" w:space="0" w:sz="4" w:val="single"/>
+        <w:bottom w:color="7F7F7F" w:space="0" w:sz="4" w:val="single"/>
+        <w:right w:color="7F7F7F" w:space="0" w:sz="4" w:val="single"/>
+        <w:insideH w:color="7F7F7F" w:space="0" w:sz="4" w:val="single"/>
+        <w:insideV w:color="7F7F7F" w:space="0" w:sz="4" w:val="single"/>
+      </w:tblBorders>
+    </w:tblPr>
+    <w:tblStylePr w:type="firstRow">
+      <w:rPr>
+        <w:b/>
+        <w:color w:val="FFFFFF"/>
+      </w:rPr>
+      <w:tcPr>
+        <w:shd w:color="auto" w:fill="0B5A3C" w:val="clear"/>
+      </w:tcPr>
+    </w:tblStylePr>
+  </w:style>
   <w:style w:type="paragraph" w:customStyle="1" w:styleId="SourceCode">
     <w:name w:val="Source Code"/>
     <w:basedOn w:val="Normal"/>
@@ -15292,7 +15603,7 @@
 </file>
 
 <file path=word/theme/theme1.xml><?xml version="1.0" encoding="utf-8"?>
-<a:theme xmlns:a="http://schemas.openxmlformats.org/drawingml/2006/main" xmlns:thm15="http://schemas.microsoft.com/office/thememl/2012/main" name="Tema di Office">
+<a:theme xmlns:a="http://schemas.openxmlformats.org/drawingml/2006/main" name="Tema di Office">
   <a:themeElements>
     <a:clrScheme name="Office">
       <a:dk1>

</xml_diff>